<commit_message>
Chỉnh sửa file AI Audit
</commit_message>
<xml_diff>
--- a/MainReport.docx
+++ b/MainReport.docx
@@ -258,6 +258,74 @@
         </w:r>
       </w:hyperlink>
     </w:p>
+    <w:p>
+      <w:pPr>
+        <w:rPr>
+          <w:rFonts w:ascii="Times New Roman" w:hAnsi="Times New Roman" w:cs="Times New Roman"/>
+          <w:sz w:val="28"/>
+          <w:szCs w:val="28"/>
+        </w:rPr>
+      </w:pPr>
+      <w:proofErr w:type="spellStart"/>
+      <w:r>
+        <w:rPr>
+          <w:rFonts w:ascii="Times New Roman" w:hAnsi="Times New Roman" w:cs="Times New Roman"/>
+          <w:sz w:val="28"/>
+          <w:szCs w:val="28"/>
+          <w:lang w:val="en-US"/>
+        </w:rPr>
+        <w:t>Github</w:t>
+      </w:r>
+      <w:proofErr w:type="spellEnd"/>
+      <w:r>
+        <w:rPr>
+          <w:rFonts w:ascii="Times New Roman" w:hAnsi="Times New Roman" w:cs="Times New Roman"/>
+          <w:sz w:val="28"/>
+          <w:szCs w:val="28"/>
+          <w:lang w:val="en-US"/>
+        </w:rPr>
+        <w:t xml:space="preserve"> repo</w:t>
+      </w:r>
+      <w:r>
+        <w:rPr>
+          <w:rFonts w:ascii="Times New Roman" w:hAnsi="Times New Roman" w:cs="Times New Roman"/>
+          <w:sz w:val="28"/>
+          <w:szCs w:val="28"/>
+          <w:lang w:val="en-US"/>
+        </w:rPr>
+        <w:t xml:space="preserve"> </w:t>
+      </w:r>
+      <w:proofErr w:type="spellStart"/>
+      <w:r>
+        <w:rPr>
+          <w:rFonts w:ascii="Times New Roman" w:hAnsi="Times New Roman" w:cs="Times New Roman"/>
+          <w:sz w:val="28"/>
+          <w:szCs w:val="28"/>
+          <w:lang w:val="en-US"/>
+        </w:rPr>
+        <w:t>của</w:t>
+      </w:r>
+      <w:proofErr w:type="spellEnd"/>
+      <w:r>
+        <w:rPr>
+          <w:rFonts w:ascii="Times New Roman" w:hAnsi="Times New Roman" w:cs="Times New Roman"/>
+          <w:sz w:val="28"/>
+          <w:szCs w:val="28"/>
+        </w:rPr>
+        <w:t xml:space="preserve"> nhóm: </w:t>
+      </w:r>
+      <w:hyperlink r:id="rId10" w:history="1">
+        <w:r>
+          <w:rPr>
+            <w:rStyle w:val="Hyperlink"/>
+            <w:rFonts w:ascii="Times New Roman" w:hAnsi="Times New Roman" w:cs="Times New Roman"/>
+            <w:sz w:val="28"/>
+            <w:szCs w:val="28"/>
+          </w:rPr>
+          <w:t>https://github.com/hoangphi117/HW02</w:t>
+        </w:r>
+      </w:hyperlink>
+    </w:p>
     <w:p/>
     <w:p>
       <w:pPr>
@@ -591,6 +659,7 @@
           <w:sz w:val="28"/>
           <w:szCs w:val="28"/>
         </w:rPr>
+        <w:lastRenderedPageBreak/>
         <w:t>Yêu cầu mật khẩu mạnh: Tối thiểu 8 ký tự, có ít nhất 1 chữ hoa, 1 chữ thường, 1 chữ số và 1 ký tự đặc biệt (@, $, !, %, *, ?, &amp;).</w:t>
       </w:r>
     </w:p>
@@ -612,7 +681,6 @@
           <w:sz w:val="28"/>
           <w:szCs w:val="28"/>
         </w:rPr>
-        <w:lastRenderedPageBreak/>
         <w:t>Phải có trường Xác nhận mật khẩu — hệ thống từ chối nếu hai trường không khớp.</w:t>
       </w:r>
     </w:p>
@@ -1533,7 +1601,7 @@
                     <pic:cNvPicPr/>
                   </pic:nvPicPr>
                   <pic:blipFill>
-                    <a:blip r:embed="rId10"/>
+                    <a:blip r:embed="rId11"/>
                     <a:stretch>
                       <a:fillRect/>
                     </a:stretch>
@@ -5345,23 +5413,7 @@
                 <w:rFonts w:ascii="Times New Roman" w:hAnsi="Times New Roman" w:cs="Times New Roman"/>
                 <w:lang w:val="en-US"/>
               </w:rPr>
-              <w:t xml:space="preserve"> </w:t>
-            </w:r>
-            <w:proofErr w:type="gramStart"/>
-            <w:r>
-              <w:rPr>
-                <w:rFonts w:ascii="Times New Roman" w:hAnsi="Times New Roman" w:cs="Times New Roman"/>
-                <w:lang w:val="en-US"/>
-              </w:rPr>
-              <w:t>`?`</w:t>
-            </w:r>
-            <w:proofErr w:type="gramEnd"/>
-            <w:r>
-              <w:rPr>
-                <w:rFonts w:ascii="Times New Roman" w:hAnsi="Times New Roman" w:cs="Times New Roman"/>
-                <w:lang w:val="en-US"/>
-              </w:rPr>
-              <w:t xml:space="preserve"> </w:t>
+              <w:t xml:space="preserve"> `?` </w:t>
             </w:r>
             <w:proofErr w:type="spellStart"/>
             <w:r>
@@ -16434,7 +16486,7 @@
                     <pic:cNvPicPr/>
                   </pic:nvPicPr>
                   <pic:blipFill>
-                    <a:blip r:embed="rId11"/>
+                    <a:blip r:embed="rId12"/>
                     <a:stretch>
                       <a:fillRect/>
                     </a:stretch>
@@ -25504,7 +25556,7 @@
         </w:rPr>
         <w:t xml:space="preserve"> POST </w:t>
       </w:r>
-      <w:hyperlink r:id="rId12" w:history="1">
+      <w:hyperlink r:id="rId13" w:history="1">
         <w:r>
           <w:rPr>
             <w:rStyle w:val="Hyperlink"/>
@@ -25760,9 +25812,9 @@
           <w:szCs w:val="28"/>
           <w:lang w:val="en-US"/>
         </w:rPr>
-        <w:t>node -e "const j=require(</w:t>
-      </w:r>
-      <w:proofErr w:type="gramStart"/>
+        <w:t>node -e "const j=require('./backend/</w:t>
+      </w:r>
+      <w:proofErr w:type="spellStart"/>
       <w:r>
         <w:rPr>
           <w:rFonts w:asciiTheme="majorHAnsi" w:hAnsiTheme="majorHAnsi" w:cstheme="majorHAnsi"/>
@@ -25770,9 +25822,9 @@
           <w:szCs w:val="28"/>
           <w:lang w:val="en-US"/>
         </w:rPr>
-        <w:t>'./</w:t>
-      </w:r>
-      <w:proofErr w:type="gramEnd"/>
+        <w:t>node_modules</w:t>
+      </w:r>
+      <w:proofErr w:type="spellEnd"/>
       <w:r>
         <w:rPr>
           <w:rFonts w:asciiTheme="majorHAnsi" w:hAnsiTheme="majorHAnsi" w:cstheme="majorHAnsi"/>
@@ -25780,7 +25832,7 @@
           <w:szCs w:val="28"/>
           <w:lang w:val="en-US"/>
         </w:rPr>
-        <w:t>backend/</w:t>
+        <w:t>/</w:t>
       </w:r>
       <w:proofErr w:type="spellStart"/>
       <w:r>
@@ -25790,7 +25842,7 @@
           <w:szCs w:val="28"/>
           <w:lang w:val="en-US"/>
         </w:rPr>
-        <w:t>node_modules</w:t>
+        <w:t>jsonwebtoken</w:t>
       </w:r>
       <w:proofErr w:type="spellEnd"/>
       <w:r>
@@ -25800,87 +25852,7 @@
           <w:szCs w:val="28"/>
           <w:lang w:val="en-US"/>
         </w:rPr>
-        <w:t>/</w:t>
-      </w:r>
-      <w:proofErr w:type="spellStart"/>
-      <w:r>
-        <w:rPr>
-          <w:rFonts w:asciiTheme="majorHAnsi" w:hAnsiTheme="majorHAnsi" w:cstheme="majorHAnsi"/>
-          <w:sz w:val="28"/>
-          <w:szCs w:val="28"/>
-          <w:lang w:val="en-US"/>
-        </w:rPr>
-        <w:t>jsonwebtoken</w:t>
-      </w:r>
-      <w:proofErr w:type="spellEnd"/>
-      <w:r>
-        <w:rPr>
-          <w:rFonts w:asciiTheme="majorHAnsi" w:hAnsiTheme="majorHAnsi" w:cstheme="majorHAnsi"/>
-          <w:sz w:val="28"/>
-          <w:szCs w:val="28"/>
-          <w:lang w:val="en-US"/>
-        </w:rPr>
-        <w:t>'); console.log(</w:t>
-      </w:r>
-      <w:proofErr w:type="gramStart"/>
-      <w:r>
-        <w:rPr>
-          <w:rFonts w:asciiTheme="majorHAnsi" w:hAnsiTheme="majorHAnsi" w:cstheme="majorHAnsi"/>
-          <w:sz w:val="28"/>
-          <w:szCs w:val="28"/>
-          <w:lang w:val="en-US"/>
-        </w:rPr>
-        <w:t>j.sign</w:t>
-      </w:r>
-      <w:proofErr w:type="gramEnd"/>
-      <w:r>
-        <w:rPr>
-          <w:rFonts w:asciiTheme="majorHAnsi" w:hAnsiTheme="majorHAnsi" w:cstheme="majorHAnsi"/>
-          <w:sz w:val="28"/>
-          <w:szCs w:val="28"/>
-          <w:lang w:val="en-US"/>
-        </w:rPr>
-        <w:t>({id:</w:t>
-      </w:r>
-      <w:proofErr w:type="gramStart"/>
-      <w:r>
-        <w:rPr>
-          <w:rFonts w:asciiTheme="majorHAnsi" w:hAnsiTheme="majorHAnsi" w:cstheme="majorHAnsi"/>
-          <w:sz w:val="28"/>
-          <w:szCs w:val="28"/>
-          <w:lang w:val="en-US"/>
-        </w:rPr>
-        <w:t>2,role</w:t>
-      </w:r>
-      <w:proofErr w:type="gramEnd"/>
-      <w:r>
-        <w:rPr>
-          <w:rFonts w:asciiTheme="majorHAnsi" w:hAnsiTheme="majorHAnsi" w:cstheme="majorHAnsi"/>
-          <w:sz w:val="28"/>
-          <w:szCs w:val="28"/>
-          <w:lang w:val="en-US"/>
-        </w:rPr>
-        <w:t>:'user</w:t>
-      </w:r>
-      <w:proofErr w:type="gramStart"/>
-      <w:r>
-        <w:rPr>
-          <w:rFonts w:asciiTheme="majorHAnsi" w:hAnsiTheme="majorHAnsi" w:cstheme="majorHAnsi"/>
-          <w:sz w:val="28"/>
-          <w:szCs w:val="28"/>
-          <w:lang w:val="en-US"/>
-        </w:rPr>
-        <w:t>',exp</w:t>
-      </w:r>
-      <w:proofErr w:type="gramEnd"/>
-      <w:r>
-        <w:rPr>
-          <w:rFonts w:asciiTheme="majorHAnsi" w:hAnsiTheme="majorHAnsi" w:cstheme="majorHAnsi"/>
-          <w:sz w:val="28"/>
-          <w:szCs w:val="28"/>
-          <w:lang w:val="en-US"/>
-        </w:rPr>
-        <w:t>:Math.floor(Date.now()/1000)-2},'super_secret_key_that_should_not_be_here'))"</w:t>
+        <w:t>'); console.log(j.sign({id:2,role:'user',exp:Math.floor(Date.now()/1000)-2},'super_secret_key_that_should_not_be_here'))"</w:t>
       </w:r>
     </w:p>
     <w:p>
@@ -25908,9 +25880,9 @@
           <w:szCs w:val="28"/>
           <w:lang w:val="en-US"/>
         </w:rPr>
-        <w:t>node -e "const j=require(</w:t>
-      </w:r>
-      <w:proofErr w:type="gramStart"/>
+        <w:t>node -e "const j=require('./backend/</w:t>
+      </w:r>
+      <w:proofErr w:type="spellStart"/>
       <w:r>
         <w:rPr>
           <w:rFonts w:asciiTheme="majorHAnsi" w:hAnsiTheme="majorHAnsi" w:cstheme="majorHAnsi"/>
@@ -25918,9 +25890,9 @@
           <w:szCs w:val="28"/>
           <w:lang w:val="en-US"/>
         </w:rPr>
-        <w:t>'./</w:t>
-      </w:r>
-      <w:proofErr w:type="gramEnd"/>
+        <w:t>node_modules</w:t>
+      </w:r>
+      <w:proofErr w:type="spellEnd"/>
       <w:r>
         <w:rPr>
           <w:rFonts w:asciiTheme="majorHAnsi" w:hAnsiTheme="majorHAnsi" w:cstheme="majorHAnsi"/>
@@ -25928,7 +25900,7 @@
           <w:szCs w:val="28"/>
           <w:lang w:val="en-US"/>
         </w:rPr>
-        <w:t>backend/</w:t>
+        <w:t>/</w:t>
       </w:r>
       <w:proofErr w:type="spellStart"/>
       <w:r>
@@ -25938,7 +25910,7 @@
           <w:szCs w:val="28"/>
           <w:lang w:val="en-US"/>
         </w:rPr>
-        <w:t>node_modules</w:t>
+        <w:t>jsonwebtoken</w:t>
       </w:r>
       <w:proofErr w:type="spellEnd"/>
       <w:r>
@@ -25948,87 +25920,7 @@
           <w:szCs w:val="28"/>
           <w:lang w:val="en-US"/>
         </w:rPr>
-        <w:t>/</w:t>
-      </w:r>
-      <w:proofErr w:type="spellStart"/>
-      <w:r>
-        <w:rPr>
-          <w:rFonts w:asciiTheme="majorHAnsi" w:hAnsiTheme="majorHAnsi" w:cstheme="majorHAnsi"/>
-          <w:sz w:val="28"/>
-          <w:szCs w:val="28"/>
-          <w:lang w:val="en-US"/>
-        </w:rPr>
-        <w:t>jsonwebtoken</w:t>
-      </w:r>
-      <w:proofErr w:type="spellEnd"/>
-      <w:r>
-        <w:rPr>
-          <w:rFonts w:asciiTheme="majorHAnsi" w:hAnsiTheme="majorHAnsi" w:cstheme="majorHAnsi"/>
-          <w:sz w:val="28"/>
-          <w:szCs w:val="28"/>
-          <w:lang w:val="en-US"/>
-        </w:rPr>
-        <w:t>'); console.log(</w:t>
-      </w:r>
-      <w:proofErr w:type="gramStart"/>
-      <w:r>
-        <w:rPr>
-          <w:rFonts w:asciiTheme="majorHAnsi" w:hAnsiTheme="majorHAnsi" w:cstheme="majorHAnsi"/>
-          <w:sz w:val="28"/>
-          <w:szCs w:val="28"/>
-          <w:lang w:val="en-US"/>
-        </w:rPr>
-        <w:t>j.sign</w:t>
-      </w:r>
-      <w:proofErr w:type="gramEnd"/>
-      <w:r>
-        <w:rPr>
-          <w:rFonts w:asciiTheme="majorHAnsi" w:hAnsiTheme="majorHAnsi" w:cstheme="majorHAnsi"/>
-          <w:sz w:val="28"/>
-          <w:szCs w:val="28"/>
-          <w:lang w:val="en-US"/>
-        </w:rPr>
-        <w:t>({id:</w:t>
-      </w:r>
-      <w:proofErr w:type="gramStart"/>
-      <w:r>
-        <w:rPr>
-          <w:rFonts w:asciiTheme="majorHAnsi" w:hAnsiTheme="majorHAnsi" w:cstheme="majorHAnsi"/>
-          <w:sz w:val="28"/>
-          <w:szCs w:val="28"/>
-          <w:lang w:val="en-US"/>
-        </w:rPr>
-        <w:t>1,role</w:t>
-      </w:r>
-      <w:proofErr w:type="gramEnd"/>
-      <w:r>
-        <w:rPr>
-          <w:rFonts w:asciiTheme="majorHAnsi" w:hAnsiTheme="majorHAnsi" w:cstheme="majorHAnsi"/>
-          <w:sz w:val="28"/>
-          <w:szCs w:val="28"/>
-          <w:lang w:val="en-US"/>
-        </w:rPr>
-        <w:t>:'admin</w:t>
-      </w:r>
-      <w:proofErr w:type="gramStart"/>
-      <w:r>
-        <w:rPr>
-          <w:rFonts w:asciiTheme="majorHAnsi" w:hAnsiTheme="majorHAnsi" w:cstheme="majorHAnsi"/>
-          <w:sz w:val="28"/>
-          <w:szCs w:val="28"/>
-          <w:lang w:val="en-US"/>
-        </w:rPr>
-        <w:t>',exp</w:t>
-      </w:r>
-      <w:proofErr w:type="gramEnd"/>
-      <w:r>
-        <w:rPr>
-          <w:rFonts w:asciiTheme="majorHAnsi" w:hAnsiTheme="majorHAnsi" w:cstheme="majorHAnsi"/>
-          <w:sz w:val="28"/>
-          <w:szCs w:val="28"/>
-          <w:lang w:val="en-US"/>
-        </w:rPr>
-        <w:t>:Math.floor(Date.now()/1000)-2},'super_secret_key_that_should_not_be_here'))"</w:t>
+        <w:t>'); console.log(j.sign({id:1,role:'admin',exp:Math.floor(Date.now()/1000)-2},'super_secret_key_that_should_not_be_here'))"</w:t>
       </w:r>
     </w:p>
     <w:p>
@@ -26878,7 +26770,7 @@
               </w:rPr>
               <w:t xml:space="preserve">gửi GET </w:t>
             </w:r>
-            <w:hyperlink r:id="rId13" w:history="1">
+            <w:hyperlink r:id="rId14" w:history="1">
               <w:r>
                 <w:rPr>
                   <w:rStyle w:val="Hyperlink"/>
@@ -28622,23 +28514,7 @@
                 <w:rFonts w:ascii="Times New Roman" w:hAnsi="Times New Roman" w:cs="Times New Roman"/>
                 <w:lang w:val="en-US"/>
               </w:rPr>
-              <w:t xml:space="preserve"> </w:t>
-            </w:r>
-            <w:proofErr w:type="gramStart"/>
-            <w:r>
-              <w:rPr>
-                <w:rFonts w:ascii="Times New Roman" w:hAnsi="Times New Roman" w:cs="Times New Roman"/>
-                <w:lang w:val="en-US"/>
-              </w:rPr>
-              <w:t>( id</w:t>
-            </w:r>
-            <w:proofErr w:type="gramEnd"/>
-            <w:r>
-              <w:rPr>
-                <w:rFonts w:ascii="Times New Roman" w:hAnsi="Times New Roman" w:cs="Times New Roman"/>
-                <w:lang w:val="en-US"/>
-              </w:rPr>
-              <w:t xml:space="preserve"> </w:t>
+              <w:t xml:space="preserve"> ( id </w:t>
             </w:r>
             <w:proofErr w:type="spellStart"/>
             <w:r>
@@ -28654,17 +28530,8 @@
                 <w:rFonts w:ascii="Times New Roman" w:hAnsi="Times New Roman" w:cs="Times New Roman"/>
                 <w:lang w:val="en-US"/>
               </w:rPr>
-              <w:t xml:space="preserve"> </w:t>
-            </w:r>
-            <w:proofErr w:type="gramStart"/>
-            <w:r>
-              <w:rPr>
-                <w:rFonts w:ascii="Times New Roman" w:hAnsi="Times New Roman" w:cs="Times New Roman"/>
-                <w:lang w:val="en-US"/>
-              </w:rPr>
-              <w:t>pending )</w:t>
-            </w:r>
-            <w:proofErr w:type="gramEnd"/>
+              <w:t xml:space="preserve"> pending )</w:t>
+            </w:r>
           </w:p>
           <w:p>
             <w:pPr>
@@ -28720,21 +28587,12 @@
               <w:t>status":"confirmed</w:t>
             </w:r>
             <w:proofErr w:type="spellEnd"/>
-            <w:proofErr w:type="gramStart"/>
-            <w:r>
-              <w:rPr>
-                <w:rFonts w:ascii="Times New Roman" w:hAnsi="Times New Roman" w:cs="Times New Roman"/>
-                <w:lang w:val="en-US"/>
-              </w:rPr>
-              <w:t>"}`</w:t>
-            </w:r>
-            <w:proofErr w:type="gramEnd"/>
-            <w:r>
-              <w:rPr>
-                <w:rFonts w:ascii="Times New Roman" w:hAnsi="Times New Roman" w:cs="Times New Roman"/>
-                <w:lang w:val="en-US"/>
-              </w:rPr>
-              <w:t>.</w:t>
+            <w:r>
+              <w:rPr>
+                <w:rFonts w:ascii="Times New Roman" w:hAnsi="Times New Roman" w:cs="Times New Roman"/>
+                <w:lang w:val="en-US"/>
+              </w:rPr>
+              <w:t>"}`.</w:t>
             </w:r>
           </w:p>
           <w:p>
@@ -30660,23 +30518,7 @@
                 <w:rFonts w:ascii="Times New Roman" w:hAnsi="Times New Roman" w:cs="Times New Roman"/>
                 <w:lang w:val="en-US"/>
               </w:rPr>
-              <w:t xml:space="preserve">4. Body JSON: </w:t>
-            </w:r>
-            <w:proofErr w:type="gramStart"/>
-            <w:r>
-              <w:rPr>
-                <w:rFonts w:ascii="Times New Roman" w:hAnsi="Times New Roman" w:cs="Times New Roman"/>
-                <w:lang w:val="en-US"/>
-              </w:rPr>
-              <w:t>`{</w:t>
-            </w:r>
-            <w:proofErr w:type="gramEnd"/>
-            <w:r>
-              <w:rPr>
-                <w:rFonts w:ascii="Times New Roman" w:hAnsi="Times New Roman" w:cs="Times New Roman"/>
-                <w:lang w:val="en-US"/>
-              </w:rPr>
-              <w:t>"</w:t>
+              <w:t>4. Body JSON: `{"</w:t>
             </w:r>
             <w:proofErr w:type="spellStart"/>
             <w:r>
@@ -30692,23 +30534,7 @@
                 <w:rFonts w:ascii="Times New Roman" w:hAnsi="Times New Roman" w:cs="Times New Roman"/>
                 <w:lang w:val="en-US"/>
               </w:rPr>
-              <w:t xml:space="preserve"> test category</w:t>
-            </w:r>
-            <w:proofErr w:type="gramStart"/>
-            <w:r>
-              <w:rPr>
-                <w:rFonts w:ascii="Times New Roman" w:hAnsi="Times New Roman" w:cs="Times New Roman"/>
-                <w:lang w:val="en-US"/>
-              </w:rPr>
-              <w:t>"}`</w:t>
-            </w:r>
-            <w:proofErr w:type="gramEnd"/>
-            <w:r>
-              <w:rPr>
-                <w:rFonts w:ascii="Times New Roman" w:hAnsi="Times New Roman" w:cs="Times New Roman"/>
-                <w:lang w:val="en-US"/>
-              </w:rPr>
-              <w:t>.</w:t>
+              <w:t xml:space="preserve"> test category"}`.</w:t>
             </w:r>
           </w:p>
           <w:p>
@@ -41356,19 +41182,7 @@
               <w:rPr>
                 <w:rFonts w:ascii="Times New Roman" w:hAnsi="Times New Roman" w:cs="Times New Roman"/>
               </w:rPr>
-              <w:t xml:space="preserve">Mở một sản phẩm </w:t>
-            </w:r>
-            <w:r>
-              <w:rPr>
-                <w:rFonts w:ascii="Times New Roman" w:hAnsi="Times New Roman" w:cs="Times New Roman"/>
-              </w:rPr>
-              <w:t xml:space="preserve">bất kì </w:t>
-            </w:r>
-            <w:r>
-              <w:rPr>
-                <w:rFonts w:ascii="Times New Roman" w:hAnsi="Times New Roman" w:cs="Times New Roman"/>
-              </w:rPr>
-              <w:t xml:space="preserve">có ảnh, tên, giá và mô tả trong </w:t>
+              <w:t xml:space="preserve">Mở một sản phẩm bất kì có ảnh, tên, giá và mô tả trong </w:t>
             </w:r>
             <w:proofErr w:type="spellStart"/>
             <w:r>
@@ -42710,13 +42524,7 @@
               <w:rPr>
                 <w:rFonts w:ascii="Times New Roman" w:hAnsi="Times New Roman" w:cs="Times New Roman"/>
               </w:rPr>
-              <w:t>2.</w:t>
-            </w:r>
-            <w:r>
-              <w:rPr>
-                <w:rFonts w:ascii="Times New Roman" w:hAnsi="Times New Roman" w:cs="Times New Roman"/>
-              </w:rPr>
-              <w:t xml:space="preserve">Mở sản phẩm có mô tả 1.500 ký tự; thử cuộn nội dung trong </w:t>
+              <w:t xml:space="preserve">2.Mở sản phẩm có mô tả 1.500 ký tự; thử cuộn nội dung trong </w:t>
             </w:r>
             <w:proofErr w:type="spellStart"/>
             <w:r>
@@ -42774,20 +42582,13 @@
             <w:pPr>
               <w:rPr>
                 <w:rFonts w:ascii="Times New Roman" w:hAnsi="Times New Roman" w:cs="Times New Roman"/>
-                <w:lang w:val="en-US"/>
-              </w:rPr>
-            </w:pPr>
-            <w:r>
-              <w:rPr>
-                <w:rFonts w:ascii="Times New Roman" w:hAnsi="Times New Roman" w:cs="Times New Roman"/>
-              </w:rPr>
-              <w:t>Nội dung 1.500 ký tự được tạo</w:t>
-            </w:r>
-            <w:r>
-              <w:rPr>
-                <w:rFonts w:ascii="Times New Roman" w:hAnsi="Times New Roman" w:cs="Times New Roman"/>
-              </w:rPr>
-              <w:t xml:space="preserve"> và đọc được bằng cách cuộn</w:t>
+              </w:rPr>
+            </w:pPr>
+            <w:r>
+              <w:rPr>
+                <w:rFonts w:ascii="Times New Roman" w:hAnsi="Times New Roman" w:cs="Times New Roman"/>
+              </w:rPr>
+              <w:t>Nội dung 1.500 ký tự được tạo và đọc được bằng cách cuộn</w:t>
             </w:r>
           </w:p>
           <w:p>
@@ -43335,22 +43136,15 @@
                 <w:rFonts w:ascii="Times New Roman" w:hAnsi="Times New Roman" w:cs="Times New Roman"/>
                 <w:lang w:val="en-US"/>
               </w:rPr>
-              <w:t>1.</w:t>
-            </w:r>
-            <w:r>
-              <w:rPr>
-                <w:rFonts w:ascii="Times New Roman" w:hAnsi="Times New Roman" w:cs="Times New Roman"/>
-                <w:lang w:val="en-US"/>
-              </w:rPr>
-              <w:t>Mở m</w:t>
-            </w:r>
-            <w:proofErr w:type="spellStart"/>
-            <w:r>
-              <w:rPr>
-                <w:rFonts w:ascii="Times New Roman" w:hAnsi="Times New Roman" w:cs="Times New Roman"/>
-                <w:lang w:val="en-US"/>
-              </w:rPr>
-              <w:t>ột</w:t>
+              <w:t xml:space="preserve">1.Mở </w:t>
+            </w:r>
+            <w:proofErr w:type="spellStart"/>
+            <w:r>
+              <w:rPr>
+                <w:rFonts w:ascii="Times New Roman" w:hAnsi="Times New Roman" w:cs="Times New Roman"/>
+                <w:lang w:val="en-US"/>
+              </w:rPr>
+              <w:t>một</w:t>
             </w:r>
             <w:proofErr w:type="spellEnd"/>
             <w:r>
@@ -44287,19 +44081,7 @@
               <w:rPr>
                 <w:rFonts w:ascii="Times New Roman" w:hAnsi="Times New Roman" w:cs="Times New Roman"/>
               </w:rPr>
-              <w:t xml:space="preserve">Giỏ có sản phẩm với </w:t>
-            </w:r>
-            <w:r>
-              <w:rPr>
-                <w:rFonts w:ascii="Times New Roman" w:hAnsi="Times New Roman" w:cs="Times New Roman"/>
-              </w:rPr>
-              <w:t>số lượng</w:t>
-            </w:r>
-            <w:r>
-              <w:rPr>
-                <w:rFonts w:ascii="Times New Roman" w:hAnsi="Times New Roman" w:cs="Times New Roman"/>
-              </w:rPr>
-              <w:t xml:space="preserve"> 3</w:t>
+              <w:t>Giỏ có sản phẩm với số lượng 3</w:t>
             </w:r>
           </w:p>
           <w:p>
@@ -44324,7 +44106,6 @@
             <w:r>
               <w:rPr>
                 <w:rFonts w:ascii="Times New Roman" w:hAnsi="Times New Roman" w:cs="Times New Roman"/>
-                <w:lang w:val="en-US"/>
               </w:rPr>
               <w:t> </w:t>
             </w:r>
@@ -44576,7 +44357,6 @@
             <w:pPr>
               <w:rPr>
                 <w:rFonts w:ascii="Times New Roman" w:hAnsi="Times New Roman" w:cs="Times New Roman"/>
-                <w:lang w:val="en-US"/>
               </w:rPr>
             </w:pPr>
             <w:r>
@@ -44596,13 +44376,7 @@
               <w:rPr>
                 <w:rFonts w:ascii="Times New Roman" w:hAnsi="Times New Roman" w:cs="Times New Roman"/>
               </w:rPr>
-              <w:t>2.</w:t>
-            </w:r>
-            <w:r>
-              <w:rPr>
-                <w:rFonts w:ascii="Times New Roman" w:hAnsi="Times New Roman" w:cs="Times New Roman"/>
-              </w:rPr>
-              <w:t xml:space="preserve">Thêm sản phẩm hợp lệ vào giỏ. </w:t>
+              <w:t xml:space="preserve">2.Thêm sản phẩm hợp lệ vào giỏ. </w:t>
             </w:r>
           </w:p>
         </w:tc>
@@ -44927,138 +44701,34 @@
               <w:rPr>
                 <w:rFonts w:ascii="Times New Roman" w:hAnsi="Times New Roman" w:cs="Times New Roman"/>
               </w:rPr>
-              <w:t xml:space="preserve">Nhập số lượng </w:t>
-            </w:r>
-            <w:r>
-              <w:rPr>
-                <w:rFonts w:ascii="Times New Roman" w:hAnsi="Times New Roman" w:cs="Times New Roman"/>
-              </w:rPr>
-              <w:t>3.</w:t>
-            </w:r>
-          </w:p>
-          <w:p>
-            <w:pPr>
-              <w:rPr>
-                <w:rFonts w:ascii="Times New Roman" w:hAnsi="Times New Roman" w:cs="Times New Roman"/>
-                <w:lang w:val="en-US"/>
-              </w:rPr>
-            </w:pPr>
-            <w:r>
-              <w:rPr>
-                <w:rFonts w:ascii="Times New Roman" w:hAnsi="Times New Roman" w:cs="Times New Roman"/>
-              </w:rPr>
-              <w:t xml:space="preserve">3. </w:t>
-            </w:r>
-            <w:r>
-              <w:rPr>
-                <w:rFonts w:ascii="Times New Roman" w:hAnsi="Times New Roman" w:cs="Times New Roman"/>
-              </w:rPr>
-              <w:t>Sau đó đổi sang sản phẩm khác</w:t>
-            </w:r>
-          </w:p>
-          <w:p>
-            <w:pPr>
-              <w:rPr>
-                <w:rFonts w:ascii="Times New Roman" w:hAnsi="Times New Roman" w:cs="Times New Roman"/>
-                <w:lang w:val="en-US"/>
-              </w:rPr>
-            </w:pPr>
-            <w:r>
-              <w:rPr>
-                <w:rFonts w:ascii="Times New Roman" w:hAnsi="Times New Roman" w:cs="Times New Roman"/>
-                <w:lang w:val="en-US"/>
-              </w:rPr>
-              <w:t xml:space="preserve">4.Quay </w:t>
-            </w:r>
-            <w:proofErr w:type="spellStart"/>
-            <w:r>
-              <w:rPr>
-                <w:rFonts w:ascii="Times New Roman" w:hAnsi="Times New Roman" w:cs="Times New Roman"/>
-                <w:lang w:val="en-US"/>
-              </w:rPr>
-              <w:t>trở</w:t>
-            </w:r>
-            <w:proofErr w:type="spellEnd"/>
-            <w:r>
-              <w:rPr>
-                <w:rFonts w:ascii="Times New Roman" w:hAnsi="Times New Roman" w:cs="Times New Roman"/>
-                <w:lang w:val="en-US"/>
-              </w:rPr>
-              <w:t xml:space="preserve"> </w:t>
-            </w:r>
-            <w:proofErr w:type="spellStart"/>
-            <w:r>
-              <w:rPr>
-                <w:rFonts w:ascii="Times New Roman" w:hAnsi="Times New Roman" w:cs="Times New Roman"/>
-                <w:lang w:val="en-US"/>
-              </w:rPr>
-              <w:t>về</w:t>
-            </w:r>
-            <w:proofErr w:type="spellEnd"/>
-            <w:r>
-              <w:rPr>
-                <w:rFonts w:ascii="Times New Roman" w:hAnsi="Times New Roman" w:cs="Times New Roman"/>
-                <w:lang w:val="en-US"/>
-              </w:rPr>
-              <w:t xml:space="preserve"> </w:t>
-            </w:r>
-            <w:proofErr w:type="spellStart"/>
-            <w:r>
-              <w:rPr>
-                <w:rFonts w:ascii="Times New Roman" w:hAnsi="Times New Roman" w:cs="Times New Roman"/>
-                <w:lang w:val="en-US"/>
-              </w:rPr>
-              <w:t>sản</w:t>
-            </w:r>
-            <w:proofErr w:type="spellEnd"/>
-            <w:r>
-              <w:rPr>
-                <w:rFonts w:ascii="Times New Roman" w:hAnsi="Times New Roman" w:cs="Times New Roman"/>
-                <w:lang w:val="en-US"/>
-              </w:rPr>
-              <w:t xml:space="preserve"> </w:t>
-            </w:r>
-            <w:proofErr w:type="spellStart"/>
-            <w:r>
-              <w:rPr>
-                <w:rFonts w:ascii="Times New Roman" w:hAnsi="Times New Roman" w:cs="Times New Roman"/>
-                <w:lang w:val="en-US"/>
-              </w:rPr>
-              <w:t>phẩm</w:t>
-            </w:r>
-            <w:proofErr w:type="spellEnd"/>
-            <w:r>
-              <w:rPr>
-                <w:rFonts w:ascii="Times New Roman" w:hAnsi="Times New Roman" w:cs="Times New Roman"/>
-                <w:lang w:val="en-US"/>
-              </w:rPr>
-              <w:t xml:space="preserve"> </w:t>
-            </w:r>
-            <w:proofErr w:type="spellStart"/>
-            <w:r>
-              <w:rPr>
-                <w:rFonts w:ascii="Times New Roman" w:hAnsi="Times New Roman" w:cs="Times New Roman"/>
-                <w:lang w:val="en-US"/>
-              </w:rPr>
-              <w:t>vừa</w:t>
-            </w:r>
-            <w:proofErr w:type="spellEnd"/>
-            <w:r>
-              <w:rPr>
-                <w:rFonts w:ascii="Times New Roman" w:hAnsi="Times New Roman" w:cs="Times New Roman"/>
-                <w:lang w:val="en-US"/>
-              </w:rPr>
-              <w:t xml:space="preserve"> </w:t>
-            </w:r>
-            <w:proofErr w:type="spellStart"/>
-            <w:r>
-              <w:rPr>
-                <w:rFonts w:ascii="Times New Roman" w:hAnsi="Times New Roman" w:cs="Times New Roman"/>
-                <w:lang w:val="en-US"/>
-              </w:rPr>
-              <w:t>sửa</w:t>
-            </w:r>
-            <w:proofErr w:type="spellEnd"/>
+              <w:t>Nhập số lượng 3.</w:t>
+            </w:r>
+          </w:p>
+          <w:p>
+            <w:pPr>
+              <w:rPr>
+                <w:rFonts w:ascii="Times New Roman" w:hAnsi="Times New Roman" w:cs="Times New Roman"/>
+              </w:rPr>
+            </w:pPr>
+            <w:r>
+              <w:rPr>
+                <w:rFonts w:ascii="Times New Roman" w:hAnsi="Times New Roman" w:cs="Times New Roman"/>
+              </w:rPr>
+              <w:t>3. Sau đó đổi sang sản phẩm khác</w:t>
+            </w:r>
+          </w:p>
+          <w:p>
+            <w:pPr>
+              <w:rPr>
+                <w:rFonts w:ascii="Times New Roman" w:hAnsi="Times New Roman" w:cs="Times New Roman"/>
+              </w:rPr>
+            </w:pPr>
+            <w:r>
+              <w:rPr>
+                <w:rFonts w:ascii="Times New Roman" w:hAnsi="Times New Roman" w:cs="Times New Roman"/>
+              </w:rPr>
+              <w:t>4.Quay trở về sản phẩm vừa sửa</w:t>
+            </w:r>
           </w:p>
           <w:p>
             <w:pPr>
@@ -45869,7 +45539,6 @@
             <w:pPr>
               <w:rPr>
                 <w:rFonts w:ascii="Times New Roman" w:hAnsi="Times New Roman" w:cs="Times New Roman"/>
-                <w:lang w:val="en-US"/>
               </w:rPr>
             </w:pPr>
             <w:r>
@@ -45878,47 +45547,12 @@
               </w:rPr>
               <w:t>3. Nhấn t</w:t>
             </w:r>
-            <w:proofErr w:type="spellStart"/>
-            <w:r>
-              <w:rPr>
-                <w:rFonts w:ascii="Times New Roman" w:hAnsi="Times New Roman" w:cs="Times New Roman"/>
-                <w:lang w:val="en-US"/>
-              </w:rPr>
-              <w:t>hêm</w:t>
-            </w:r>
-            <w:proofErr w:type="spellEnd"/>
-            <w:r>
-              <w:rPr>
-                <w:rFonts w:ascii="Times New Roman" w:hAnsi="Times New Roman" w:cs="Times New Roman"/>
-                <w:lang w:val="en-US"/>
-              </w:rPr>
-              <w:t xml:space="preserve"> </w:t>
-            </w:r>
-            <w:proofErr w:type="spellStart"/>
-            <w:r>
-              <w:rPr>
-                <w:rFonts w:ascii="Times New Roman" w:hAnsi="Times New Roman" w:cs="Times New Roman"/>
-                <w:lang w:val="en-US"/>
-              </w:rPr>
-              <w:t>vào</w:t>
-            </w:r>
-            <w:proofErr w:type="spellEnd"/>
-            <w:r>
-              <w:rPr>
-                <w:rFonts w:ascii="Times New Roman" w:hAnsi="Times New Roman" w:cs="Times New Roman"/>
-                <w:lang w:val="en-US"/>
-              </w:rPr>
-              <w:t xml:space="preserve"> </w:t>
-            </w:r>
-            <w:proofErr w:type="spellStart"/>
-            <w:r>
-              <w:rPr>
-                <w:rFonts w:ascii="Times New Roman" w:hAnsi="Times New Roman" w:cs="Times New Roman"/>
-                <w:lang w:val="en-US"/>
-              </w:rPr>
-              <w:t>giỏ</w:t>
-            </w:r>
-            <w:proofErr w:type="spellEnd"/>
+            <w:r>
+              <w:rPr>
+                <w:rFonts w:ascii="Times New Roman" w:hAnsi="Times New Roman" w:cs="Times New Roman"/>
+              </w:rPr>
+              <w:t>hêm vào giỏ</w:t>
+            </w:r>
           </w:p>
         </w:tc>
         <w:tc>
@@ -45929,111 +45563,19 @@
             <w:pPr>
               <w:rPr>
                 <w:rFonts w:ascii="Times New Roman" w:hAnsi="Times New Roman" w:cs="Times New Roman"/>
-                <w:lang w:val="en-US"/>
-              </w:rPr>
-            </w:pPr>
-            <w:proofErr w:type="spellStart"/>
-            <w:r>
-              <w:rPr>
-                <w:rFonts w:ascii="Times New Roman" w:hAnsi="Times New Roman" w:cs="Times New Roman"/>
-                <w:lang w:val="en-US"/>
-              </w:rPr>
-              <w:t>Từ</w:t>
-            </w:r>
-            <w:proofErr w:type="spellEnd"/>
-            <w:r>
-              <w:rPr>
-                <w:rFonts w:ascii="Times New Roman" w:hAnsi="Times New Roman" w:cs="Times New Roman"/>
-                <w:lang w:val="en-US"/>
-              </w:rPr>
-              <w:t xml:space="preserve"> </w:t>
-            </w:r>
-            <w:proofErr w:type="spellStart"/>
-            <w:r>
-              <w:rPr>
-                <w:rFonts w:ascii="Times New Roman" w:hAnsi="Times New Roman" w:cs="Times New Roman"/>
-                <w:lang w:val="en-US"/>
-              </w:rPr>
-              <w:t>chối</w:t>
-            </w:r>
-            <w:proofErr w:type="spellEnd"/>
-            <w:r>
-              <w:rPr>
-                <w:rFonts w:ascii="Times New Roman" w:hAnsi="Times New Roman" w:cs="Times New Roman"/>
-                <w:lang w:val="en-US"/>
-              </w:rPr>
-              <w:t xml:space="preserve">; </w:t>
-            </w:r>
-            <w:proofErr w:type="spellStart"/>
-            <w:r>
-              <w:rPr>
-                <w:rFonts w:ascii="Times New Roman" w:hAnsi="Times New Roman" w:cs="Times New Roman"/>
-                <w:lang w:val="en-US"/>
-              </w:rPr>
-              <w:t>không</w:t>
-            </w:r>
-            <w:proofErr w:type="spellEnd"/>
-            <w:r>
-              <w:rPr>
-                <w:rFonts w:ascii="Times New Roman" w:hAnsi="Times New Roman" w:cs="Times New Roman"/>
-                <w:lang w:val="en-US"/>
-              </w:rPr>
-              <w:t xml:space="preserve"> </w:t>
-            </w:r>
-            <w:proofErr w:type="spellStart"/>
-            <w:r>
-              <w:rPr>
-                <w:rFonts w:ascii="Times New Roman" w:hAnsi="Times New Roman" w:cs="Times New Roman"/>
-                <w:lang w:val="en-US"/>
-              </w:rPr>
-              <w:t>thêm</w:t>
-            </w:r>
-            <w:proofErr w:type="spellEnd"/>
-            <w:r>
-              <w:rPr>
-                <w:rFonts w:ascii="Times New Roman" w:hAnsi="Times New Roman" w:cs="Times New Roman"/>
-                <w:lang w:val="en-US"/>
-              </w:rPr>
-              <w:t xml:space="preserve"> </w:t>
-            </w:r>
-            <w:proofErr w:type="spellStart"/>
-            <w:r>
-              <w:rPr>
-                <w:rFonts w:ascii="Times New Roman" w:hAnsi="Times New Roman" w:cs="Times New Roman"/>
-                <w:lang w:val="en-US"/>
-              </w:rPr>
-              <w:t>sản</w:t>
-            </w:r>
-            <w:proofErr w:type="spellEnd"/>
-            <w:r>
-              <w:rPr>
-                <w:rFonts w:ascii="Times New Roman" w:hAnsi="Times New Roman" w:cs="Times New Roman"/>
-                <w:lang w:val="en-US"/>
-              </w:rPr>
-              <w:t xml:space="preserve"> </w:t>
-            </w:r>
-            <w:proofErr w:type="spellStart"/>
-            <w:r>
-              <w:rPr>
-                <w:rFonts w:ascii="Times New Roman" w:hAnsi="Times New Roman" w:cs="Times New Roman"/>
-                <w:lang w:val="en-US"/>
-              </w:rPr>
-              <w:t>phẩm</w:t>
-            </w:r>
-            <w:proofErr w:type="spellEnd"/>
-            <w:r>
-              <w:rPr>
-                <w:rFonts w:ascii="Times New Roman" w:hAnsi="Times New Roman" w:cs="Times New Roman"/>
-                <w:lang w:val="en-US"/>
-              </w:rPr>
-              <w:t>.</w:t>
-            </w:r>
-          </w:p>
-          <w:p>
-            <w:pPr>
-              <w:rPr>
-                <w:rFonts w:ascii="Times New Roman" w:hAnsi="Times New Roman" w:cs="Times New Roman"/>
-                <w:lang w:val="en-US"/>
+              </w:rPr>
+            </w:pPr>
+            <w:r>
+              <w:rPr>
+                <w:rFonts w:ascii="Times New Roman" w:hAnsi="Times New Roman" w:cs="Times New Roman"/>
+              </w:rPr>
+              <w:t>Từ chối; không thêm sản phẩm.</w:t>
+            </w:r>
+          </w:p>
+          <w:p>
+            <w:pPr>
+              <w:rPr>
+                <w:rFonts w:ascii="Times New Roman" w:hAnsi="Times New Roman" w:cs="Times New Roman"/>
               </w:rPr>
             </w:pPr>
           </w:p>
@@ -46046,127 +45588,13 @@
             <w:pPr>
               <w:rPr>
                 <w:rFonts w:ascii="Times New Roman" w:hAnsi="Times New Roman" w:cs="Times New Roman"/>
-                <w:lang w:val="en-US"/>
-              </w:rPr>
-            </w:pPr>
-            <w:proofErr w:type="spellStart"/>
-            <w:r>
-              <w:rPr>
-                <w:rFonts w:ascii="Times New Roman" w:hAnsi="Times New Roman" w:cs="Times New Roman"/>
-                <w:lang w:val="en-US"/>
-              </w:rPr>
-              <w:t>Âm</w:t>
-            </w:r>
-            <w:proofErr w:type="spellEnd"/>
-            <w:r>
-              <w:rPr>
-                <w:rFonts w:ascii="Times New Roman" w:hAnsi="Times New Roman" w:cs="Times New Roman"/>
-                <w:lang w:val="en-US"/>
-              </w:rPr>
-              <w:t xml:space="preserve"> </w:t>
-            </w:r>
-            <w:proofErr w:type="spellStart"/>
-            <w:r>
-              <w:rPr>
-                <w:rFonts w:ascii="Times New Roman" w:hAnsi="Times New Roman" w:cs="Times New Roman"/>
-                <w:lang w:val="en-US"/>
-              </w:rPr>
-              <w:t>thầm</w:t>
-            </w:r>
-            <w:proofErr w:type="spellEnd"/>
-            <w:r>
-              <w:rPr>
-                <w:rFonts w:ascii="Times New Roman" w:hAnsi="Times New Roman" w:cs="Times New Roman"/>
-                <w:lang w:val="en-US"/>
-              </w:rPr>
-              <w:t xml:space="preserve"> </w:t>
-            </w:r>
-            <w:proofErr w:type="spellStart"/>
-            <w:r>
-              <w:rPr>
-                <w:rFonts w:ascii="Times New Roman" w:hAnsi="Times New Roman" w:cs="Times New Roman"/>
-                <w:lang w:val="en-US"/>
-              </w:rPr>
-              <w:t>chuẩn</w:t>
-            </w:r>
-            <w:proofErr w:type="spellEnd"/>
-            <w:r>
-              <w:rPr>
-                <w:rFonts w:ascii="Times New Roman" w:hAnsi="Times New Roman" w:cs="Times New Roman"/>
-                <w:lang w:val="en-US"/>
-              </w:rPr>
-              <w:t xml:space="preserve"> </w:t>
-            </w:r>
-            <w:proofErr w:type="spellStart"/>
-            <w:r>
-              <w:rPr>
-                <w:rFonts w:ascii="Times New Roman" w:hAnsi="Times New Roman" w:cs="Times New Roman"/>
-                <w:lang w:val="en-US"/>
-              </w:rPr>
-              <w:t>hóa</w:t>
-            </w:r>
-            <w:proofErr w:type="spellEnd"/>
-            <w:r>
-              <w:rPr>
-                <w:rFonts w:ascii="Times New Roman" w:hAnsi="Times New Roman" w:cs="Times New Roman"/>
-                <w:lang w:val="en-US"/>
-              </w:rPr>
-              <w:t xml:space="preserve"> </w:t>
-            </w:r>
-            <w:proofErr w:type="spellStart"/>
-            <w:r>
-              <w:rPr>
-                <w:rFonts w:ascii="Times New Roman" w:hAnsi="Times New Roman" w:cs="Times New Roman"/>
-                <w:lang w:val="en-US"/>
-              </w:rPr>
-              <w:t>thà</w:t>
-            </w:r>
-            <w:r>
-              <w:rPr>
-                <w:rFonts w:ascii="Times New Roman" w:hAnsi="Times New Roman" w:cs="Times New Roman"/>
-                <w:lang w:val="en-US"/>
-              </w:rPr>
-              <w:t>nh</w:t>
-            </w:r>
-            <w:proofErr w:type="spellEnd"/>
-            <w:r>
-              <w:rPr>
-                <w:rFonts w:ascii="Times New Roman" w:hAnsi="Times New Roman" w:cs="Times New Roman"/>
-                <w:lang w:val="en-US"/>
-              </w:rPr>
-              <w:t xml:space="preserve"> </w:t>
-            </w:r>
-            <w:proofErr w:type="spellStart"/>
-            <w:r>
-              <w:rPr>
-                <w:rFonts w:ascii="Times New Roman" w:hAnsi="Times New Roman" w:cs="Times New Roman"/>
-                <w:lang w:val="en-US"/>
-              </w:rPr>
-              <w:t>số</w:t>
-            </w:r>
-            <w:proofErr w:type="spellEnd"/>
-            <w:r>
-              <w:rPr>
-                <w:rFonts w:ascii="Times New Roman" w:hAnsi="Times New Roman" w:cs="Times New Roman"/>
-                <w:lang w:val="en-US"/>
-              </w:rPr>
-              <w:t xml:space="preserve"> </w:t>
-            </w:r>
-            <w:proofErr w:type="spellStart"/>
-            <w:r>
-              <w:rPr>
-                <w:rFonts w:ascii="Times New Roman" w:hAnsi="Times New Roman" w:cs="Times New Roman"/>
-                <w:lang w:val="en-US"/>
-              </w:rPr>
-              <w:t>lượng</w:t>
-            </w:r>
-            <w:proofErr w:type="spellEnd"/>
-            <w:r>
-              <w:rPr>
-                <w:rFonts w:ascii="Times New Roman" w:hAnsi="Times New Roman" w:cs="Times New Roman"/>
-                <w:lang w:val="en-US"/>
-              </w:rPr>
-              <w:t xml:space="preserve"> 1</w:t>
+              </w:rPr>
+            </w:pPr>
+            <w:r>
+              <w:rPr>
+                <w:rFonts w:ascii="Times New Roman" w:hAnsi="Times New Roman" w:cs="Times New Roman"/>
+              </w:rPr>
+              <w:t>Âm thầm chuẩn hóa thành số lượng 1</w:t>
             </w:r>
           </w:p>
         </w:tc>
@@ -46215,14 +45643,7 @@
                 <w:rFonts w:ascii="Times New Roman" w:hAnsi="Times New Roman" w:cs="Times New Roman"/>
                 <w:lang w:val="en-US"/>
               </w:rPr>
-              <w:t>B</w:t>
-            </w:r>
-            <w:r>
-              <w:rPr>
-                <w:rFonts w:ascii="Times New Roman" w:hAnsi="Times New Roman" w:cs="Times New Roman"/>
-                <w:lang w:val="en-US"/>
-              </w:rPr>
-              <w:t>02</w:t>
+              <w:t>B02</w:t>
             </w:r>
           </w:p>
           <w:p>
@@ -46873,7 +46294,6 @@
             <w:pPr>
               <w:rPr>
                 <w:rFonts w:ascii="Times New Roman" w:hAnsi="Times New Roman" w:cs="Times New Roman"/>
-                <w:lang w:val="en-US"/>
               </w:rPr>
             </w:pPr>
             <w:r>
@@ -46896,7 +46316,6 @@
             <w:r>
               <w:rPr>
                 <w:rFonts w:ascii="Times New Roman" w:hAnsi="Times New Roman" w:cs="Times New Roman"/>
-                <w:lang w:val="en-US"/>
               </w:rPr>
               <w:t>Nhập</w:t>
             </w:r>
@@ -46904,18 +46323,11 @@
               <w:rPr>
                 <w:rFonts w:ascii="Times New Roman" w:hAnsi="Times New Roman" w:cs="Times New Roman"/>
               </w:rPr>
-              <w:t xml:space="preserve"> số lượng </w:t>
-            </w:r>
-            <w:r>
-              <w:rPr>
-                <w:rFonts w:ascii="Times New Roman" w:hAnsi="Times New Roman" w:cs="Times New Roman"/>
-              </w:rPr>
-              <w:t>3</w:t>
-            </w:r>
-            <w:r>
-              <w:rPr>
-                <w:rFonts w:ascii="Times New Roman" w:hAnsi="Times New Roman" w:cs="Times New Roman"/>
-                <w:lang w:val="en-US"/>
+              <w:t xml:space="preserve"> số lượng 3</w:t>
+            </w:r>
+            <w:r>
+              <w:rPr>
+                <w:rFonts w:ascii="Times New Roman" w:hAnsi="Times New Roman" w:cs="Times New Roman"/>
               </w:rPr>
               <w:t>.</w:t>
             </w:r>
@@ -47199,7 +46611,6 @@
             <w:r>
               <w:rPr>
                 <w:rFonts w:ascii="Times New Roman" w:hAnsi="Times New Roman" w:cs="Times New Roman"/>
-                <w:lang w:val="en-US"/>
               </w:rPr>
               <w:t>-1</w:t>
             </w:r>
@@ -47424,7 +46835,6 @@
             <w:pPr>
               <w:rPr>
                 <w:rFonts w:ascii="Times New Roman" w:hAnsi="Times New Roman" w:cs="Times New Roman"/>
-                <w:lang w:val="en-US"/>
               </w:rPr>
             </w:pPr>
             <w:r>
@@ -47458,7 +46868,6 @@
             <w:r>
               <w:rPr>
                 <w:rFonts w:ascii="Times New Roman" w:hAnsi="Times New Roman" w:cs="Times New Roman"/>
-                <w:lang w:val="en-US"/>
               </w:rPr>
               <w:t>1.5</w:t>
             </w:r>
@@ -47467,7 +46876,6 @@
             <w:pPr>
               <w:rPr>
                 <w:rFonts w:ascii="Times New Roman" w:hAnsi="Times New Roman" w:cs="Times New Roman"/>
-                <w:lang w:val="en-US"/>
               </w:rPr>
             </w:pPr>
             <w:r>
@@ -47713,7 +47121,6 @@
             <w:pPr>
               <w:rPr>
                 <w:rFonts w:ascii="Times New Roman" w:hAnsi="Times New Roman" w:cs="Times New Roman"/>
-                <w:lang w:val="en-US"/>
               </w:rPr>
             </w:pPr>
             <w:r>
@@ -47731,41 +47138,14 @@
             <w:r>
               <w:rPr>
                 <w:rFonts w:ascii="Times New Roman" w:hAnsi="Times New Roman" w:cs="Times New Roman"/>
-                <w:lang w:val="en-US"/>
-              </w:rPr>
-              <w:t xml:space="preserve">g </w:t>
-            </w:r>
-            <w:proofErr w:type="spellStart"/>
-            <w:r>
-              <w:rPr>
-                <w:rFonts w:ascii="Times New Roman" w:hAnsi="Times New Roman" w:cs="Times New Roman"/>
-                <w:lang w:val="en-US"/>
-              </w:rPr>
-              <w:t>số</w:t>
-            </w:r>
-            <w:proofErr w:type="spellEnd"/>
-            <w:r>
-              <w:rPr>
-                <w:rFonts w:ascii="Times New Roman" w:hAnsi="Times New Roman" w:cs="Times New Roman"/>
-                <w:lang w:val="en-US"/>
-              </w:rPr>
-              <w:t xml:space="preserve"> </w:t>
-            </w:r>
-            <w:proofErr w:type="spellStart"/>
-            <w:r>
-              <w:rPr>
-                <w:rFonts w:ascii="Times New Roman" w:hAnsi="Times New Roman" w:cs="Times New Roman"/>
-                <w:lang w:val="en-US"/>
-              </w:rPr>
-              <w:t>lượng</w:t>
-            </w:r>
-            <w:proofErr w:type="spellEnd"/>
-          </w:p>
-          <w:p>
-            <w:pPr>
-              <w:rPr>
-                <w:rFonts w:ascii="Times New Roman" w:hAnsi="Times New Roman" w:cs="Times New Roman"/>
-                <w:lang w:val="en-US"/>
+              </w:rPr>
+              <w:t>g số lượng</w:t>
+            </w:r>
+          </w:p>
+          <w:p>
+            <w:pPr>
+              <w:rPr>
+                <w:rFonts w:ascii="Times New Roman" w:hAnsi="Times New Roman" w:cs="Times New Roman"/>
               </w:rPr>
             </w:pPr>
             <w:r>
@@ -47791,7 +47171,6 @@
             <w:pPr>
               <w:rPr>
                 <w:rFonts w:ascii="Times New Roman" w:hAnsi="Times New Roman" w:cs="Times New Roman"/>
-                <w:lang w:val="en-US"/>
               </w:rPr>
             </w:pPr>
             <w:r>
@@ -49020,18 +48399,7 @@
           <w:szCs w:val="28"/>
           <w:lang w:val="en-US"/>
         </w:rPr>
-        <w:t xml:space="preserve">V. </w:t>
-      </w:r>
-      <w:r>
-        <w:rPr>
-          <w:rFonts w:ascii="Times New Roman" w:hAnsi="Times New Roman" w:cs="Times New Roman"/>
-          <w:b/>
-          <w:bCs/>
-          <w:sz w:val="28"/>
-          <w:szCs w:val="28"/>
-          <w:lang w:val="en-US"/>
-        </w:rPr>
-        <w:t>AI gap analysis.</w:t>
+        <w:t>V. AI gap analysis.</w:t>
       </w:r>
     </w:p>
     <w:p>
@@ -49689,6 +49057,46 @@
           <w:szCs w:val="28"/>
           <w:lang w:val="en-US"/>
         </w:rPr>
+        <w:t xml:space="preserve"> ra TC </w:t>
+      </w:r>
+      <w:proofErr w:type="spellStart"/>
+      <w:r>
+        <w:rPr>
+          <w:rFonts w:ascii="Times New Roman" w:hAnsi="Times New Roman" w:cs="Times New Roman"/>
+          <w:sz w:val="28"/>
+          <w:szCs w:val="28"/>
+          <w:lang w:val="en-US"/>
+        </w:rPr>
+        <w:t>của</w:t>
+      </w:r>
+      <w:proofErr w:type="spellEnd"/>
+      <w:r>
+        <w:rPr>
+          <w:rFonts w:ascii="Times New Roman" w:hAnsi="Times New Roman" w:cs="Times New Roman"/>
+          <w:sz w:val="28"/>
+          <w:szCs w:val="28"/>
+          <w:lang w:val="en-US"/>
+        </w:rPr>
+        <w:t xml:space="preserve"> pool </w:t>
+      </w:r>
+      <w:proofErr w:type="spellStart"/>
+      <w:r>
+        <w:rPr>
+          <w:rFonts w:ascii="Times New Roman" w:hAnsi="Times New Roman" w:cs="Times New Roman"/>
+          <w:sz w:val="28"/>
+          <w:szCs w:val="28"/>
+          <w:lang w:val="en-US"/>
+        </w:rPr>
+        <w:t>và</w:t>
+      </w:r>
+      <w:proofErr w:type="spellEnd"/>
+      <w:r>
+        <w:rPr>
+          <w:rFonts w:ascii="Times New Roman" w:hAnsi="Times New Roman" w:cs="Times New Roman"/>
+          <w:sz w:val="28"/>
+          <w:szCs w:val="28"/>
+          <w:lang w:val="en-US"/>
+        </w:rPr>
         <w:t xml:space="preserve"> </w:t>
       </w:r>
       <w:proofErr w:type="spellStart"/>
@@ -49699,7 +49107,7 @@
           <w:szCs w:val="28"/>
           <w:lang w:val="en-US"/>
         </w:rPr>
-        <w:t>ra</w:t>
+        <w:t>thực</w:t>
       </w:r>
       <w:proofErr w:type="spellEnd"/>
       <w:r>
@@ -49709,7 +49117,7 @@
           <w:szCs w:val="28"/>
           <w:lang w:val="en-US"/>
         </w:rPr>
-        <w:t xml:space="preserve"> TC </w:t>
+        <w:t xml:space="preserve"> </w:t>
       </w:r>
       <w:proofErr w:type="spellStart"/>
       <w:r>
@@ -49719,7 +49127,7 @@
           <w:szCs w:val="28"/>
           <w:lang w:val="en-US"/>
         </w:rPr>
-        <w:t>của</w:t>
+        <w:t>hiện</w:t>
       </w:r>
       <w:proofErr w:type="spellEnd"/>
       <w:r>
@@ -49729,7 +49137,7 @@
           <w:szCs w:val="28"/>
           <w:lang w:val="en-US"/>
         </w:rPr>
-        <w:t xml:space="preserve"> pool </w:t>
+        <w:t xml:space="preserve"> </w:t>
       </w:r>
       <w:proofErr w:type="spellStart"/>
       <w:r>
@@ -49739,6 +49147,633 @@
           <w:szCs w:val="28"/>
           <w:lang w:val="en-US"/>
         </w:rPr>
+        <w:t>luôn</w:t>
+      </w:r>
+      <w:proofErr w:type="spellEnd"/>
+      <w:r>
+        <w:rPr>
+          <w:rFonts w:ascii="Times New Roman" w:hAnsi="Times New Roman" w:cs="Times New Roman"/>
+          <w:sz w:val="28"/>
+          <w:szCs w:val="28"/>
+          <w:lang w:val="en-US"/>
+        </w:rPr>
+        <w:t xml:space="preserve"> </w:t>
+      </w:r>
+      <w:proofErr w:type="spellStart"/>
+      <w:r>
+        <w:rPr>
+          <w:rFonts w:ascii="Times New Roman" w:hAnsi="Times New Roman" w:cs="Times New Roman"/>
+          <w:sz w:val="28"/>
+          <w:szCs w:val="28"/>
+          <w:lang w:val="en-US"/>
+        </w:rPr>
+        <w:t>phần</w:t>
+      </w:r>
+      <w:proofErr w:type="spellEnd"/>
+      <w:r>
+        <w:rPr>
+          <w:rFonts w:ascii="Times New Roman" w:hAnsi="Times New Roman" w:cs="Times New Roman"/>
+          <w:sz w:val="28"/>
+          <w:szCs w:val="28"/>
+          <w:lang w:val="en-US"/>
+        </w:rPr>
+        <w:t xml:space="preserve"> </w:t>
+      </w:r>
+      <w:proofErr w:type="spellStart"/>
+      <w:r>
+        <w:rPr>
+          <w:rFonts w:ascii="Times New Roman" w:hAnsi="Times New Roman" w:cs="Times New Roman"/>
+          <w:sz w:val="28"/>
+          <w:szCs w:val="28"/>
+          <w:lang w:val="en-US"/>
+        </w:rPr>
+        <w:t>kiểm</w:t>
+      </w:r>
+      <w:proofErr w:type="spellEnd"/>
+      <w:r>
+        <w:rPr>
+          <w:rFonts w:ascii="Times New Roman" w:hAnsi="Times New Roman" w:cs="Times New Roman"/>
+          <w:sz w:val="28"/>
+          <w:szCs w:val="28"/>
+          <w:lang w:val="en-US"/>
+        </w:rPr>
+        <w:t xml:space="preserve"> </w:t>
+      </w:r>
+      <w:proofErr w:type="spellStart"/>
+      <w:r>
+        <w:rPr>
+          <w:rFonts w:ascii="Times New Roman" w:hAnsi="Times New Roman" w:cs="Times New Roman"/>
+          <w:sz w:val="28"/>
+          <w:szCs w:val="28"/>
+          <w:lang w:val="en-US"/>
+        </w:rPr>
+        <w:t>thử</w:t>
+      </w:r>
+      <w:proofErr w:type="spellEnd"/>
+      <w:r>
+        <w:rPr>
+          <w:rFonts w:ascii="Times New Roman" w:hAnsi="Times New Roman" w:cs="Times New Roman"/>
+          <w:sz w:val="28"/>
+          <w:szCs w:val="28"/>
+          <w:lang w:val="en-US"/>
+        </w:rPr>
+        <w:t xml:space="preserve">. Tuy </w:t>
+      </w:r>
+      <w:proofErr w:type="spellStart"/>
+      <w:r>
+        <w:rPr>
+          <w:rFonts w:ascii="Times New Roman" w:hAnsi="Times New Roman" w:cs="Times New Roman"/>
+          <w:sz w:val="28"/>
+          <w:szCs w:val="28"/>
+          <w:lang w:val="en-US"/>
+        </w:rPr>
+        <w:t>nhiên</w:t>
+      </w:r>
+      <w:proofErr w:type="spellEnd"/>
+      <w:r>
+        <w:rPr>
+          <w:rFonts w:ascii="Times New Roman" w:hAnsi="Times New Roman" w:cs="Times New Roman"/>
+          <w:sz w:val="28"/>
+          <w:szCs w:val="28"/>
+          <w:lang w:val="en-US"/>
+        </w:rPr>
+        <w:t xml:space="preserve">, AI </w:t>
+      </w:r>
+      <w:proofErr w:type="spellStart"/>
+      <w:r>
+        <w:rPr>
+          <w:rFonts w:ascii="Times New Roman" w:hAnsi="Times New Roman" w:cs="Times New Roman"/>
+          <w:sz w:val="28"/>
+          <w:szCs w:val="28"/>
+          <w:lang w:val="en-US"/>
+        </w:rPr>
+        <w:t>đã</w:t>
+      </w:r>
+      <w:proofErr w:type="spellEnd"/>
+      <w:r>
+        <w:rPr>
+          <w:rFonts w:ascii="Times New Roman" w:hAnsi="Times New Roman" w:cs="Times New Roman"/>
+          <w:sz w:val="28"/>
+          <w:szCs w:val="28"/>
+          <w:lang w:val="en-US"/>
+        </w:rPr>
+        <w:t xml:space="preserve"> </w:t>
+      </w:r>
+      <w:proofErr w:type="spellStart"/>
+      <w:r>
+        <w:rPr>
+          <w:rFonts w:ascii="Times New Roman" w:hAnsi="Times New Roman" w:cs="Times New Roman"/>
+          <w:sz w:val="28"/>
+          <w:szCs w:val="28"/>
+          <w:lang w:val="en-US"/>
+        </w:rPr>
+        <w:t>không</w:t>
+      </w:r>
+      <w:proofErr w:type="spellEnd"/>
+      <w:r>
+        <w:rPr>
+          <w:rFonts w:ascii="Times New Roman" w:hAnsi="Times New Roman" w:cs="Times New Roman"/>
+          <w:sz w:val="28"/>
+          <w:szCs w:val="28"/>
+          <w:lang w:val="en-US"/>
+        </w:rPr>
+        <w:t xml:space="preserve"> </w:t>
+      </w:r>
+      <w:proofErr w:type="spellStart"/>
+      <w:r>
+        <w:rPr>
+          <w:rFonts w:ascii="Times New Roman" w:hAnsi="Times New Roman" w:cs="Times New Roman"/>
+          <w:sz w:val="28"/>
+          <w:szCs w:val="28"/>
+          <w:lang w:val="en-US"/>
+        </w:rPr>
+        <w:t>thực</w:t>
+      </w:r>
+      <w:proofErr w:type="spellEnd"/>
+      <w:r>
+        <w:rPr>
+          <w:rFonts w:ascii="Times New Roman" w:hAnsi="Times New Roman" w:cs="Times New Roman"/>
+          <w:sz w:val="28"/>
+          <w:szCs w:val="28"/>
+          <w:lang w:val="en-US"/>
+        </w:rPr>
+        <w:t xml:space="preserve"> </w:t>
+      </w:r>
+      <w:proofErr w:type="spellStart"/>
+      <w:r>
+        <w:rPr>
+          <w:rFonts w:ascii="Times New Roman" w:hAnsi="Times New Roman" w:cs="Times New Roman"/>
+          <w:sz w:val="28"/>
+          <w:szCs w:val="28"/>
+          <w:lang w:val="en-US"/>
+        </w:rPr>
+        <w:t>hiện</w:t>
+      </w:r>
+      <w:proofErr w:type="spellEnd"/>
+      <w:r>
+        <w:rPr>
+          <w:rFonts w:ascii="Times New Roman" w:hAnsi="Times New Roman" w:cs="Times New Roman"/>
+          <w:sz w:val="28"/>
+          <w:szCs w:val="28"/>
+          <w:lang w:val="en-US"/>
+        </w:rPr>
+        <w:t xml:space="preserve"> </w:t>
+      </w:r>
+      <w:proofErr w:type="spellStart"/>
+      <w:r>
+        <w:rPr>
+          <w:rFonts w:ascii="Times New Roman" w:hAnsi="Times New Roman" w:cs="Times New Roman"/>
+          <w:sz w:val="28"/>
+          <w:szCs w:val="28"/>
+          <w:lang w:val="en-US"/>
+        </w:rPr>
+        <w:t>chụp</w:t>
+      </w:r>
+      <w:proofErr w:type="spellEnd"/>
+      <w:r>
+        <w:rPr>
+          <w:rFonts w:ascii="Times New Roman" w:hAnsi="Times New Roman" w:cs="Times New Roman"/>
+          <w:sz w:val="28"/>
+          <w:szCs w:val="28"/>
+          <w:lang w:val="en-US"/>
+        </w:rPr>
+        <w:t xml:space="preserve"> </w:t>
+      </w:r>
+      <w:proofErr w:type="spellStart"/>
+      <w:r>
+        <w:rPr>
+          <w:rFonts w:ascii="Times New Roman" w:hAnsi="Times New Roman" w:cs="Times New Roman"/>
+          <w:sz w:val="28"/>
+          <w:szCs w:val="28"/>
+          <w:lang w:val="en-US"/>
+        </w:rPr>
+        <w:t>hình</w:t>
+      </w:r>
+      <w:proofErr w:type="spellEnd"/>
+      <w:r>
+        <w:rPr>
+          <w:rFonts w:ascii="Times New Roman" w:hAnsi="Times New Roman" w:cs="Times New Roman"/>
+          <w:sz w:val="28"/>
+          <w:szCs w:val="28"/>
+          <w:lang w:val="en-US"/>
+        </w:rPr>
+        <w:t xml:space="preserve"> </w:t>
+      </w:r>
+      <w:proofErr w:type="spellStart"/>
+      <w:r>
+        <w:rPr>
+          <w:rFonts w:ascii="Times New Roman" w:hAnsi="Times New Roman" w:cs="Times New Roman"/>
+          <w:sz w:val="28"/>
+          <w:szCs w:val="28"/>
+          <w:lang w:val="en-US"/>
+        </w:rPr>
+        <w:t>bất</w:t>
+      </w:r>
+      <w:proofErr w:type="spellEnd"/>
+      <w:r>
+        <w:rPr>
+          <w:rFonts w:ascii="Times New Roman" w:hAnsi="Times New Roman" w:cs="Times New Roman"/>
+          <w:sz w:val="28"/>
+          <w:szCs w:val="28"/>
+          <w:lang w:val="en-US"/>
+        </w:rPr>
+        <w:t xml:space="preserve"> </w:t>
+      </w:r>
+      <w:proofErr w:type="spellStart"/>
+      <w:r>
+        <w:rPr>
+          <w:rFonts w:ascii="Times New Roman" w:hAnsi="Times New Roman" w:cs="Times New Roman"/>
+          <w:sz w:val="28"/>
+          <w:szCs w:val="28"/>
+          <w:lang w:val="en-US"/>
+        </w:rPr>
+        <w:t>kì</w:t>
+      </w:r>
+      <w:proofErr w:type="spellEnd"/>
+      <w:r>
+        <w:rPr>
+          <w:rFonts w:ascii="Times New Roman" w:hAnsi="Times New Roman" w:cs="Times New Roman"/>
+          <w:sz w:val="28"/>
+          <w:szCs w:val="28"/>
+          <w:lang w:val="en-US"/>
+        </w:rPr>
+        <w:t xml:space="preserve"> </w:t>
+      </w:r>
+      <w:proofErr w:type="spellStart"/>
+      <w:r>
+        <w:rPr>
+          <w:rFonts w:ascii="Times New Roman" w:hAnsi="Times New Roman" w:cs="Times New Roman"/>
+          <w:sz w:val="28"/>
+          <w:szCs w:val="28"/>
+          <w:lang w:val="en-US"/>
+        </w:rPr>
+        <w:t>dẫn</w:t>
+      </w:r>
+      <w:proofErr w:type="spellEnd"/>
+      <w:r>
+        <w:rPr>
+          <w:rFonts w:ascii="Times New Roman" w:hAnsi="Times New Roman" w:cs="Times New Roman"/>
+          <w:sz w:val="28"/>
+          <w:szCs w:val="28"/>
+          <w:lang w:val="en-US"/>
+        </w:rPr>
+        <w:t xml:space="preserve"> </w:t>
+      </w:r>
+      <w:proofErr w:type="spellStart"/>
+      <w:r>
+        <w:rPr>
+          <w:rFonts w:ascii="Times New Roman" w:hAnsi="Times New Roman" w:cs="Times New Roman"/>
+          <w:sz w:val="28"/>
+          <w:szCs w:val="28"/>
+          <w:lang w:val="en-US"/>
+        </w:rPr>
+        <w:t>chứng</w:t>
+      </w:r>
+      <w:proofErr w:type="spellEnd"/>
+      <w:r>
+        <w:rPr>
+          <w:rFonts w:ascii="Times New Roman" w:hAnsi="Times New Roman" w:cs="Times New Roman"/>
+          <w:sz w:val="28"/>
+          <w:szCs w:val="28"/>
+          <w:lang w:val="en-US"/>
+        </w:rPr>
+        <w:t xml:space="preserve"> </w:t>
+      </w:r>
+      <w:proofErr w:type="spellStart"/>
+      <w:r>
+        <w:rPr>
+          <w:rFonts w:ascii="Times New Roman" w:hAnsi="Times New Roman" w:cs="Times New Roman"/>
+          <w:sz w:val="28"/>
+          <w:szCs w:val="28"/>
+          <w:lang w:val="en-US"/>
+        </w:rPr>
+        <w:t>nào</w:t>
+      </w:r>
+      <w:proofErr w:type="spellEnd"/>
+      <w:r>
+        <w:rPr>
+          <w:rFonts w:ascii="Times New Roman" w:hAnsi="Times New Roman" w:cs="Times New Roman"/>
+          <w:sz w:val="28"/>
+          <w:szCs w:val="28"/>
+          <w:lang w:val="en-US"/>
+        </w:rPr>
+        <w:t xml:space="preserve"> </w:t>
+      </w:r>
+      <w:proofErr w:type="spellStart"/>
+      <w:r>
+        <w:rPr>
+          <w:rFonts w:ascii="Times New Roman" w:hAnsi="Times New Roman" w:cs="Times New Roman"/>
+          <w:sz w:val="28"/>
+          <w:szCs w:val="28"/>
+          <w:lang w:val="en-US"/>
+        </w:rPr>
+        <w:t>về</w:t>
+      </w:r>
+      <w:proofErr w:type="spellEnd"/>
+      <w:r>
+        <w:rPr>
+          <w:rFonts w:ascii="Times New Roman" w:hAnsi="Times New Roman" w:cs="Times New Roman"/>
+          <w:sz w:val="28"/>
+          <w:szCs w:val="28"/>
+          <w:lang w:val="en-US"/>
+        </w:rPr>
+        <w:t xml:space="preserve"> </w:t>
+      </w:r>
+      <w:proofErr w:type="spellStart"/>
+      <w:r>
+        <w:rPr>
+          <w:rFonts w:ascii="Times New Roman" w:hAnsi="Times New Roman" w:cs="Times New Roman"/>
+          <w:sz w:val="28"/>
+          <w:szCs w:val="28"/>
+          <w:lang w:val="en-US"/>
+        </w:rPr>
+        <w:t>những</w:t>
+      </w:r>
+      <w:proofErr w:type="spellEnd"/>
+      <w:r>
+        <w:rPr>
+          <w:rFonts w:ascii="Times New Roman" w:hAnsi="Times New Roman" w:cs="Times New Roman"/>
+          <w:sz w:val="28"/>
+          <w:szCs w:val="28"/>
+          <w:lang w:val="en-US"/>
+        </w:rPr>
+        <w:t xml:space="preserve"> </w:t>
+      </w:r>
+      <w:proofErr w:type="spellStart"/>
+      <w:r>
+        <w:rPr>
+          <w:rFonts w:ascii="Times New Roman" w:hAnsi="Times New Roman" w:cs="Times New Roman"/>
+          <w:sz w:val="28"/>
+          <w:szCs w:val="28"/>
+          <w:lang w:val="en-US"/>
+        </w:rPr>
+        <w:t>lỗi</w:t>
+      </w:r>
+      <w:proofErr w:type="spellEnd"/>
+      <w:r>
+        <w:rPr>
+          <w:rFonts w:ascii="Times New Roman" w:hAnsi="Times New Roman" w:cs="Times New Roman"/>
+          <w:sz w:val="28"/>
+          <w:szCs w:val="28"/>
+          <w:lang w:val="en-US"/>
+        </w:rPr>
+        <w:t xml:space="preserve"> </w:t>
+      </w:r>
+      <w:proofErr w:type="spellStart"/>
+      <w:r>
+        <w:rPr>
+          <w:rFonts w:ascii="Times New Roman" w:hAnsi="Times New Roman" w:cs="Times New Roman"/>
+          <w:sz w:val="28"/>
+          <w:szCs w:val="28"/>
+          <w:lang w:val="en-US"/>
+        </w:rPr>
+        <w:t>mà</w:t>
+      </w:r>
+      <w:proofErr w:type="spellEnd"/>
+      <w:r>
+        <w:rPr>
+          <w:rFonts w:ascii="Times New Roman" w:hAnsi="Times New Roman" w:cs="Times New Roman"/>
+          <w:sz w:val="28"/>
+          <w:szCs w:val="28"/>
+          <w:lang w:val="en-US"/>
+        </w:rPr>
+        <w:t xml:space="preserve"> AI </w:t>
+      </w:r>
+      <w:proofErr w:type="spellStart"/>
+      <w:r>
+        <w:rPr>
+          <w:rFonts w:ascii="Times New Roman" w:hAnsi="Times New Roman" w:cs="Times New Roman"/>
+          <w:sz w:val="28"/>
+          <w:szCs w:val="28"/>
+          <w:lang w:val="en-US"/>
+        </w:rPr>
+        <w:t>đã</w:t>
+      </w:r>
+      <w:proofErr w:type="spellEnd"/>
+      <w:r>
+        <w:rPr>
+          <w:rFonts w:ascii="Times New Roman" w:hAnsi="Times New Roman" w:cs="Times New Roman"/>
+          <w:sz w:val="28"/>
+          <w:szCs w:val="28"/>
+          <w:lang w:val="en-US"/>
+        </w:rPr>
+        <w:t xml:space="preserve"> </w:t>
+      </w:r>
+      <w:r>
+        <w:rPr>
+          <w:rFonts w:ascii="Times New Roman" w:hAnsi="Times New Roman" w:cs="Times New Roman"/>
+          <w:sz w:val="28"/>
+          <w:szCs w:val="28"/>
+          <w:lang w:val="en-US"/>
+        </w:rPr>
+        <w:t xml:space="preserve">test FAIL </w:t>
+      </w:r>
+      <w:r>
+        <w:rPr>
+          <w:rFonts w:ascii="Times New Roman" w:hAnsi="Times New Roman" w:cs="Times New Roman"/>
+          <w:sz w:val="28"/>
+          <w:szCs w:val="28"/>
+          <w:lang w:val="en-US"/>
+        </w:rPr>
+        <w:sym w:font="Symbol" w:char="F0AE"/>
+      </w:r>
+      <w:r>
+        <w:rPr>
+          <w:rFonts w:ascii="Times New Roman" w:hAnsi="Times New Roman" w:cs="Times New Roman"/>
+          <w:sz w:val="28"/>
+          <w:szCs w:val="28"/>
+          <w:lang w:val="en-US"/>
+        </w:rPr>
+        <w:t xml:space="preserve"> Do </w:t>
+      </w:r>
+      <w:proofErr w:type="spellStart"/>
+      <w:r>
+        <w:rPr>
+          <w:rFonts w:ascii="Times New Roman" w:hAnsi="Times New Roman" w:cs="Times New Roman"/>
+          <w:sz w:val="28"/>
+          <w:szCs w:val="28"/>
+          <w:lang w:val="en-US"/>
+        </w:rPr>
+        <w:t>tôi</w:t>
+      </w:r>
+      <w:proofErr w:type="spellEnd"/>
+      <w:r>
+        <w:rPr>
+          <w:rFonts w:ascii="Times New Roman" w:hAnsi="Times New Roman" w:cs="Times New Roman"/>
+          <w:sz w:val="28"/>
+          <w:szCs w:val="28"/>
+          <w:lang w:val="en-US"/>
+        </w:rPr>
+        <w:t xml:space="preserve"> </w:t>
+      </w:r>
+      <w:proofErr w:type="spellStart"/>
+      <w:r>
+        <w:rPr>
+          <w:rFonts w:ascii="Times New Roman" w:hAnsi="Times New Roman" w:cs="Times New Roman"/>
+          <w:sz w:val="28"/>
+          <w:szCs w:val="28"/>
+          <w:lang w:val="en-US"/>
+        </w:rPr>
+        <w:t>không</w:t>
+      </w:r>
+      <w:proofErr w:type="spellEnd"/>
+      <w:r>
+        <w:rPr>
+          <w:rFonts w:ascii="Times New Roman" w:hAnsi="Times New Roman" w:cs="Times New Roman"/>
+          <w:sz w:val="28"/>
+          <w:szCs w:val="28"/>
+          <w:lang w:val="en-US"/>
+        </w:rPr>
+        <w:t xml:space="preserve"> prompt </w:t>
+      </w:r>
+      <w:proofErr w:type="spellStart"/>
+      <w:r>
+        <w:rPr>
+          <w:rFonts w:ascii="Times New Roman" w:hAnsi="Times New Roman" w:cs="Times New Roman"/>
+          <w:sz w:val="28"/>
+          <w:szCs w:val="28"/>
+          <w:lang w:val="en-US"/>
+        </w:rPr>
+        <w:t>yêu</w:t>
+      </w:r>
+      <w:proofErr w:type="spellEnd"/>
+      <w:r>
+        <w:rPr>
+          <w:rFonts w:ascii="Times New Roman" w:hAnsi="Times New Roman" w:cs="Times New Roman"/>
+          <w:sz w:val="28"/>
+          <w:szCs w:val="28"/>
+          <w:lang w:val="en-US"/>
+        </w:rPr>
+        <w:t xml:space="preserve"> </w:t>
+      </w:r>
+      <w:proofErr w:type="spellStart"/>
+      <w:r>
+        <w:rPr>
+          <w:rFonts w:ascii="Times New Roman" w:hAnsi="Times New Roman" w:cs="Times New Roman"/>
+          <w:sz w:val="28"/>
+          <w:szCs w:val="28"/>
+          <w:lang w:val="en-US"/>
+        </w:rPr>
+        <w:t>cầu</w:t>
+      </w:r>
+      <w:proofErr w:type="spellEnd"/>
+      <w:r>
+        <w:rPr>
+          <w:rFonts w:ascii="Times New Roman" w:hAnsi="Times New Roman" w:cs="Times New Roman"/>
+          <w:sz w:val="28"/>
+          <w:szCs w:val="28"/>
+          <w:lang w:val="en-US"/>
+        </w:rPr>
+        <w:t xml:space="preserve">, </w:t>
+      </w:r>
+      <w:proofErr w:type="spellStart"/>
+      <w:r>
+        <w:rPr>
+          <w:rFonts w:ascii="Times New Roman" w:hAnsi="Times New Roman" w:cs="Times New Roman"/>
+          <w:sz w:val="28"/>
+          <w:szCs w:val="28"/>
+          <w:lang w:val="en-US"/>
+        </w:rPr>
+        <w:t>nhưng</w:t>
+      </w:r>
+      <w:proofErr w:type="spellEnd"/>
+      <w:r>
+        <w:rPr>
+          <w:rFonts w:ascii="Times New Roman" w:hAnsi="Times New Roman" w:cs="Times New Roman"/>
+          <w:sz w:val="28"/>
+          <w:szCs w:val="28"/>
+          <w:lang w:val="en-US"/>
+        </w:rPr>
+        <w:t xml:space="preserve"> AI </w:t>
+      </w:r>
+      <w:proofErr w:type="spellStart"/>
+      <w:r>
+        <w:rPr>
+          <w:rFonts w:ascii="Times New Roman" w:hAnsi="Times New Roman" w:cs="Times New Roman"/>
+          <w:sz w:val="28"/>
+          <w:szCs w:val="28"/>
+          <w:lang w:val="en-US"/>
+        </w:rPr>
+        <w:t>đã</w:t>
+      </w:r>
+      <w:proofErr w:type="spellEnd"/>
+      <w:r>
+        <w:rPr>
+          <w:rFonts w:ascii="Times New Roman" w:hAnsi="Times New Roman" w:cs="Times New Roman"/>
+          <w:sz w:val="28"/>
+          <w:szCs w:val="28"/>
+          <w:lang w:val="en-US"/>
+        </w:rPr>
+        <w:t xml:space="preserve"> </w:t>
+      </w:r>
+      <w:proofErr w:type="spellStart"/>
+      <w:r>
+        <w:rPr>
+          <w:rFonts w:ascii="Times New Roman" w:hAnsi="Times New Roman" w:cs="Times New Roman"/>
+          <w:sz w:val="28"/>
+          <w:szCs w:val="28"/>
+          <w:lang w:val="en-US"/>
+        </w:rPr>
+        <w:t>đọc</w:t>
+      </w:r>
+      <w:proofErr w:type="spellEnd"/>
+      <w:r>
+        <w:rPr>
+          <w:rFonts w:ascii="Times New Roman" w:hAnsi="Times New Roman" w:cs="Times New Roman"/>
+          <w:sz w:val="28"/>
+          <w:szCs w:val="28"/>
+          <w:lang w:val="en-US"/>
+        </w:rPr>
+        <w:t xml:space="preserve"> </w:t>
+      </w:r>
+      <w:proofErr w:type="spellStart"/>
+      <w:r>
+        <w:rPr>
+          <w:rFonts w:ascii="Times New Roman" w:hAnsi="Times New Roman" w:cs="Times New Roman"/>
+          <w:sz w:val="28"/>
+          <w:szCs w:val="28"/>
+          <w:lang w:val="en-US"/>
+        </w:rPr>
+        <w:t>đề</w:t>
+      </w:r>
+      <w:proofErr w:type="spellEnd"/>
+      <w:r>
+        <w:rPr>
+          <w:rFonts w:ascii="Times New Roman" w:hAnsi="Times New Roman" w:cs="Times New Roman"/>
+          <w:sz w:val="28"/>
+          <w:szCs w:val="28"/>
+          <w:lang w:val="en-US"/>
+        </w:rPr>
+        <w:t xml:space="preserve"> </w:t>
+      </w:r>
+      <w:proofErr w:type="spellStart"/>
+      <w:r>
+        <w:rPr>
+          <w:rFonts w:ascii="Times New Roman" w:hAnsi="Times New Roman" w:cs="Times New Roman"/>
+          <w:sz w:val="28"/>
+          <w:szCs w:val="28"/>
+          <w:lang w:val="en-US"/>
+        </w:rPr>
+        <w:t>bài</w:t>
+      </w:r>
+      <w:proofErr w:type="spellEnd"/>
+      <w:r>
+        <w:rPr>
+          <w:rFonts w:ascii="Times New Roman" w:hAnsi="Times New Roman" w:cs="Times New Roman"/>
+          <w:sz w:val="28"/>
+          <w:szCs w:val="28"/>
+          <w:lang w:val="en-US"/>
+        </w:rPr>
+        <w:t xml:space="preserve"> </w:t>
+      </w:r>
+      <w:proofErr w:type="spellStart"/>
+      <w:r>
+        <w:rPr>
+          <w:rFonts w:ascii="Times New Roman" w:hAnsi="Times New Roman" w:cs="Times New Roman"/>
+          <w:sz w:val="28"/>
+          <w:szCs w:val="28"/>
+          <w:lang w:val="en-US"/>
+        </w:rPr>
         <w:t>và</w:t>
       </w:r>
       <w:proofErr w:type="spellEnd"/>
@@ -49759,7 +49794,7 @@
           <w:szCs w:val="28"/>
           <w:lang w:val="en-US"/>
         </w:rPr>
-        <w:t>thực</w:t>
+        <w:t>có</w:t>
       </w:r>
       <w:proofErr w:type="spellEnd"/>
       <w:r>
@@ -49779,7 +49814,7 @@
           <w:szCs w:val="28"/>
           <w:lang w:val="en-US"/>
         </w:rPr>
-        <w:t>hiện</w:t>
+        <w:t>tóm</w:t>
       </w:r>
       <w:proofErr w:type="spellEnd"/>
       <w:r>
@@ -49799,7 +49834,7 @@
           <w:szCs w:val="28"/>
           <w:lang w:val="en-US"/>
         </w:rPr>
-        <w:t>luôn</w:t>
+        <w:t>tắt</w:t>
       </w:r>
       <w:proofErr w:type="spellEnd"/>
       <w:r>
@@ -49819,7 +49854,7 @@
           <w:szCs w:val="28"/>
           <w:lang w:val="en-US"/>
         </w:rPr>
-        <w:t>phần</w:t>
+        <w:t>lúc</w:t>
       </w:r>
       <w:proofErr w:type="spellEnd"/>
       <w:r>
@@ -49839,7 +49874,7 @@
           <w:szCs w:val="28"/>
           <w:lang w:val="en-US"/>
         </w:rPr>
-        <w:t>kiểm</w:t>
+        <w:t>trước</w:t>
       </w:r>
       <w:proofErr w:type="spellEnd"/>
       <w:r>
@@ -49859,7 +49894,7 @@
           <w:szCs w:val="28"/>
           <w:lang w:val="en-US"/>
         </w:rPr>
-        <w:t>thử</w:t>
+        <w:t>rằng</w:t>
       </w:r>
       <w:proofErr w:type="spellEnd"/>
       <w:r>
@@ -49869,7 +49904,7 @@
           <w:szCs w:val="28"/>
           <w:lang w:val="en-US"/>
         </w:rPr>
-        <w:t xml:space="preserve">. Tuy </w:t>
+        <w:t xml:space="preserve"> </w:t>
       </w:r>
       <w:proofErr w:type="spellStart"/>
       <w:r>
@@ -49879,7 +49914,7 @@
           <w:szCs w:val="28"/>
           <w:lang w:val="en-US"/>
         </w:rPr>
-        <w:t>nhiên</w:t>
+        <w:t>phải</w:t>
       </w:r>
       <w:proofErr w:type="spellEnd"/>
       <w:r>
@@ -49889,7 +49924,7 @@
           <w:szCs w:val="28"/>
           <w:lang w:val="en-US"/>
         </w:rPr>
-        <w:t xml:space="preserve">, AI </w:t>
+        <w:t xml:space="preserve"> </w:t>
       </w:r>
       <w:proofErr w:type="spellStart"/>
       <w:r>
@@ -49899,694 +49934,7 @@
           <w:szCs w:val="28"/>
           <w:lang w:val="en-US"/>
         </w:rPr>
-        <w:t>đã</w:t>
-      </w:r>
-      <w:proofErr w:type="spellEnd"/>
-      <w:r>
-        <w:rPr>
-          <w:rFonts w:ascii="Times New Roman" w:hAnsi="Times New Roman" w:cs="Times New Roman"/>
-          <w:sz w:val="28"/>
-          <w:szCs w:val="28"/>
-          <w:lang w:val="en-US"/>
-        </w:rPr>
-        <w:t xml:space="preserve"> </w:t>
-      </w:r>
-      <w:proofErr w:type="spellStart"/>
-      <w:r>
-        <w:rPr>
-          <w:rFonts w:ascii="Times New Roman" w:hAnsi="Times New Roman" w:cs="Times New Roman"/>
-          <w:sz w:val="28"/>
-          <w:szCs w:val="28"/>
-          <w:lang w:val="en-US"/>
-        </w:rPr>
-        <w:t>không</w:t>
-      </w:r>
-      <w:proofErr w:type="spellEnd"/>
-      <w:r>
-        <w:rPr>
-          <w:rFonts w:ascii="Times New Roman" w:hAnsi="Times New Roman" w:cs="Times New Roman"/>
-          <w:sz w:val="28"/>
-          <w:szCs w:val="28"/>
-          <w:lang w:val="en-US"/>
-        </w:rPr>
-        <w:t xml:space="preserve"> </w:t>
-      </w:r>
-      <w:proofErr w:type="spellStart"/>
-      <w:r>
-        <w:rPr>
-          <w:rFonts w:ascii="Times New Roman" w:hAnsi="Times New Roman" w:cs="Times New Roman"/>
-          <w:sz w:val="28"/>
-          <w:szCs w:val="28"/>
-          <w:lang w:val="en-US"/>
-        </w:rPr>
-        <w:t>thực</w:t>
-      </w:r>
-      <w:proofErr w:type="spellEnd"/>
-      <w:r>
-        <w:rPr>
-          <w:rFonts w:ascii="Times New Roman" w:hAnsi="Times New Roman" w:cs="Times New Roman"/>
-          <w:sz w:val="28"/>
-          <w:szCs w:val="28"/>
-          <w:lang w:val="en-US"/>
-        </w:rPr>
-        <w:t xml:space="preserve"> </w:t>
-      </w:r>
-      <w:proofErr w:type="spellStart"/>
-      <w:r>
-        <w:rPr>
-          <w:rFonts w:ascii="Times New Roman" w:hAnsi="Times New Roman" w:cs="Times New Roman"/>
-          <w:sz w:val="28"/>
-          <w:szCs w:val="28"/>
-          <w:lang w:val="en-US"/>
-        </w:rPr>
-        <w:t>hiện</w:t>
-      </w:r>
-      <w:proofErr w:type="spellEnd"/>
-      <w:r>
-        <w:rPr>
-          <w:rFonts w:ascii="Times New Roman" w:hAnsi="Times New Roman" w:cs="Times New Roman"/>
-          <w:sz w:val="28"/>
-          <w:szCs w:val="28"/>
-          <w:lang w:val="en-US"/>
-        </w:rPr>
-        <w:t xml:space="preserve"> </w:t>
-      </w:r>
-      <w:proofErr w:type="spellStart"/>
-      <w:r>
-        <w:rPr>
-          <w:rFonts w:ascii="Times New Roman" w:hAnsi="Times New Roman" w:cs="Times New Roman"/>
-          <w:sz w:val="28"/>
-          <w:szCs w:val="28"/>
-          <w:lang w:val="en-US"/>
-        </w:rPr>
         <w:t>chụp</w:t>
-      </w:r>
-      <w:proofErr w:type="spellEnd"/>
-      <w:r>
-        <w:rPr>
-          <w:rFonts w:ascii="Times New Roman" w:hAnsi="Times New Roman" w:cs="Times New Roman"/>
-          <w:sz w:val="28"/>
-          <w:szCs w:val="28"/>
-          <w:lang w:val="en-US"/>
-        </w:rPr>
-        <w:t xml:space="preserve"> </w:t>
-      </w:r>
-      <w:proofErr w:type="spellStart"/>
-      <w:r>
-        <w:rPr>
-          <w:rFonts w:ascii="Times New Roman" w:hAnsi="Times New Roman" w:cs="Times New Roman"/>
-          <w:sz w:val="28"/>
-          <w:szCs w:val="28"/>
-          <w:lang w:val="en-US"/>
-        </w:rPr>
-        <w:t>hình</w:t>
-      </w:r>
-      <w:proofErr w:type="spellEnd"/>
-      <w:r>
-        <w:rPr>
-          <w:rFonts w:ascii="Times New Roman" w:hAnsi="Times New Roman" w:cs="Times New Roman"/>
-          <w:sz w:val="28"/>
-          <w:szCs w:val="28"/>
-          <w:lang w:val="en-US"/>
-        </w:rPr>
-        <w:t xml:space="preserve"> </w:t>
-      </w:r>
-      <w:proofErr w:type="spellStart"/>
-      <w:r>
-        <w:rPr>
-          <w:rFonts w:ascii="Times New Roman" w:hAnsi="Times New Roman" w:cs="Times New Roman"/>
-          <w:sz w:val="28"/>
-          <w:szCs w:val="28"/>
-          <w:lang w:val="en-US"/>
-        </w:rPr>
-        <w:t>bất</w:t>
-      </w:r>
-      <w:proofErr w:type="spellEnd"/>
-      <w:r>
-        <w:rPr>
-          <w:rFonts w:ascii="Times New Roman" w:hAnsi="Times New Roman" w:cs="Times New Roman"/>
-          <w:sz w:val="28"/>
-          <w:szCs w:val="28"/>
-          <w:lang w:val="en-US"/>
-        </w:rPr>
-        <w:t xml:space="preserve"> </w:t>
-      </w:r>
-      <w:proofErr w:type="spellStart"/>
-      <w:r>
-        <w:rPr>
-          <w:rFonts w:ascii="Times New Roman" w:hAnsi="Times New Roman" w:cs="Times New Roman"/>
-          <w:sz w:val="28"/>
-          <w:szCs w:val="28"/>
-          <w:lang w:val="en-US"/>
-        </w:rPr>
-        <w:t>kì</w:t>
-      </w:r>
-      <w:proofErr w:type="spellEnd"/>
-      <w:r>
-        <w:rPr>
-          <w:rFonts w:ascii="Times New Roman" w:hAnsi="Times New Roman" w:cs="Times New Roman"/>
-          <w:sz w:val="28"/>
-          <w:szCs w:val="28"/>
-          <w:lang w:val="en-US"/>
-        </w:rPr>
-        <w:t xml:space="preserve"> </w:t>
-      </w:r>
-      <w:proofErr w:type="spellStart"/>
-      <w:r>
-        <w:rPr>
-          <w:rFonts w:ascii="Times New Roman" w:hAnsi="Times New Roman" w:cs="Times New Roman"/>
-          <w:sz w:val="28"/>
-          <w:szCs w:val="28"/>
-          <w:lang w:val="en-US"/>
-        </w:rPr>
-        <w:t>dẫn</w:t>
-      </w:r>
-      <w:proofErr w:type="spellEnd"/>
-      <w:r>
-        <w:rPr>
-          <w:rFonts w:ascii="Times New Roman" w:hAnsi="Times New Roman" w:cs="Times New Roman"/>
-          <w:sz w:val="28"/>
-          <w:szCs w:val="28"/>
-          <w:lang w:val="en-US"/>
-        </w:rPr>
-        <w:t xml:space="preserve"> </w:t>
-      </w:r>
-      <w:proofErr w:type="spellStart"/>
-      <w:r>
-        <w:rPr>
-          <w:rFonts w:ascii="Times New Roman" w:hAnsi="Times New Roman" w:cs="Times New Roman"/>
-          <w:sz w:val="28"/>
-          <w:szCs w:val="28"/>
-          <w:lang w:val="en-US"/>
-        </w:rPr>
-        <w:t>chứng</w:t>
-      </w:r>
-      <w:proofErr w:type="spellEnd"/>
-      <w:r>
-        <w:rPr>
-          <w:rFonts w:ascii="Times New Roman" w:hAnsi="Times New Roman" w:cs="Times New Roman"/>
-          <w:sz w:val="28"/>
-          <w:szCs w:val="28"/>
-          <w:lang w:val="en-US"/>
-        </w:rPr>
-        <w:t xml:space="preserve"> </w:t>
-      </w:r>
-      <w:proofErr w:type="spellStart"/>
-      <w:r>
-        <w:rPr>
-          <w:rFonts w:ascii="Times New Roman" w:hAnsi="Times New Roman" w:cs="Times New Roman"/>
-          <w:sz w:val="28"/>
-          <w:szCs w:val="28"/>
-          <w:lang w:val="en-US"/>
-        </w:rPr>
-        <w:t>nào</w:t>
-      </w:r>
-      <w:proofErr w:type="spellEnd"/>
-      <w:r>
-        <w:rPr>
-          <w:rFonts w:ascii="Times New Roman" w:hAnsi="Times New Roman" w:cs="Times New Roman"/>
-          <w:sz w:val="28"/>
-          <w:szCs w:val="28"/>
-          <w:lang w:val="en-US"/>
-        </w:rPr>
-        <w:t xml:space="preserve"> </w:t>
-      </w:r>
-      <w:proofErr w:type="spellStart"/>
-      <w:r>
-        <w:rPr>
-          <w:rFonts w:ascii="Times New Roman" w:hAnsi="Times New Roman" w:cs="Times New Roman"/>
-          <w:sz w:val="28"/>
-          <w:szCs w:val="28"/>
-          <w:lang w:val="en-US"/>
-        </w:rPr>
-        <w:t>về</w:t>
-      </w:r>
-      <w:proofErr w:type="spellEnd"/>
-      <w:r>
-        <w:rPr>
-          <w:rFonts w:ascii="Times New Roman" w:hAnsi="Times New Roman" w:cs="Times New Roman"/>
-          <w:sz w:val="28"/>
-          <w:szCs w:val="28"/>
-          <w:lang w:val="en-US"/>
-        </w:rPr>
-        <w:t xml:space="preserve"> </w:t>
-      </w:r>
-      <w:proofErr w:type="spellStart"/>
-      <w:r>
-        <w:rPr>
-          <w:rFonts w:ascii="Times New Roman" w:hAnsi="Times New Roman" w:cs="Times New Roman"/>
-          <w:sz w:val="28"/>
-          <w:szCs w:val="28"/>
-          <w:lang w:val="en-US"/>
-        </w:rPr>
-        <w:t>những</w:t>
-      </w:r>
-      <w:proofErr w:type="spellEnd"/>
-      <w:r>
-        <w:rPr>
-          <w:rFonts w:ascii="Times New Roman" w:hAnsi="Times New Roman" w:cs="Times New Roman"/>
-          <w:sz w:val="28"/>
-          <w:szCs w:val="28"/>
-          <w:lang w:val="en-US"/>
-        </w:rPr>
-        <w:t xml:space="preserve"> </w:t>
-      </w:r>
-      <w:proofErr w:type="spellStart"/>
-      <w:r>
-        <w:rPr>
-          <w:rFonts w:ascii="Times New Roman" w:hAnsi="Times New Roman" w:cs="Times New Roman"/>
-          <w:sz w:val="28"/>
-          <w:szCs w:val="28"/>
-          <w:lang w:val="en-US"/>
-        </w:rPr>
-        <w:t>lỗi</w:t>
-      </w:r>
-      <w:proofErr w:type="spellEnd"/>
-      <w:r>
-        <w:rPr>
-          <w:rFonts w:ascii="Times New Roman" w:hAnsi="Times New Roman" w:cs="Times New Roman"/>
-          <w:sz w:val="28"/>
-          <w:szCs w:val="28"/>
-          <w:lang w:val="en-US"/>
-        </w:rPr>
-        <w:t xml:space="preserve"> </w:t>
-      </w:r>
-      <w:proofErr w:type="spellStart"/>
-      <w:r>
-        <w:rPr>
-          <w:rFonts w:ascii="Times New Roman" w:hAnsi="Times New Roman" w:cs="Times New Roman"/>
-          <w:sz w:val="28"/>
-          <w:szCs w:val="28"/>
-          <w:lang w:val="en-US"/>
-        </w:rPr>
-        <w:t>mà</w:t>
-      </w:r>
-      <w:proofErr w:type="spellEnd"/>
-      <w:r>
-        <w:rPr>
-          <w:rFonts w:ascii="Times New Roman" w:hAnsi="Times New Roman" w:cs="Times New Roman"/>
-          <w:sz w:val="28"/>
-          <w:szCs w:val="28"/>
-          <w:lang w:val="en-US"/>
-        </w:rPr>
-        <w:t xml:space="preserve"> AI </w:t>
-      </w:r>
-      <w:proofErr w:type="spellStart"/>
-      <w:r>
-        <w:rPr>
-          <w:rFonts w:ascii="Times New Roman" w:hAnsi="Times New Roman" w:cs="Times New Roman"/>
-          <w:sz w:val="28"/>
-          <w:szCs w:val="28"/>
-          <w:lang w:val="en-US"/>
-        </w:rPr>
-        <w:t>đã</w:t>
-      </w:r>
-      <w:proofErr w:type="spellEnd"/>
-      <w:r>
-        <w:rPr>
-          <w:rFonts w:ascii="Times New Roman" w:hAnsi="Times New Roman" w:cs="Times New Roman"/>
-          <w:sz w:val="28"/>
-          <w:szCs w:val="28"/>
-          <w:lang w:val="en-US"/>
-        </w:rPr>
-        <w:t xml:space="preserve"> </w:t>
-      </w:r>
-      <w:r>
-        <w:rPr>
-          <w:rFonts w:ascii="Times New Roman" w:hAnsi="Times New Roman" w:cs="Times New Roman"/>
-          <w:sz w:val="28"/>
-          <w:szCs w:val="28"/>
-          <w:lang w:val="en-US"/>
-        </w:rPr>
-        <w:t xml:space="preserve">test FAIL </w:t>
-      </w:r>
-      <w:r>
-        <w:rPr>
-          <w:rFonts w:ascii="Times New Roman" w:hAnsi="Times New Roman" w:cs="Times New Roman"/>
-          <w:sz w:val="28"/>
-          <w:szCs w:val="28"/>
-          <w:lang w:val="en-US"/>
-        </w:rPr>
-        <w:sym w:font="Symbol" w:char="F0AE"/>
-      </w:r>
-      <w:r>
-        <w:rPr>
-          <w:rFonts w:ascii="Times New Roman" w:hAnsi="Times New Roman" w:cs="Times New Roman"/>
-          <w:sz w:val="28"/>
-          <w:szCs w:val="28"/>
-          <w:lang w:val="en-US"/>
-        </w:rPr>
-        <w:t xml:space="preserve"> Do </w:t>
-      </w:r>
-      <w:proofErr w:type="spellStart"/>
-      <w:r>
-        <w:rPr>
-          <w:rFonts w:ascii="Times New Roman" w:hAnsi="Times New Roman" w:cs="Times New Roman"/>
-          <w:sz w:val="28"/>
-          <w:szCs w:val="28"/>
-          <w:lang w:val="en-US"/>
-        </w:rPr>
-        <w:t>tôi</w:t>
-      </w:r>
-      <w:proofErr w:type="spellEnd"/>
-      <w:r>
-        <w:rPr>
-          <w:rFonts w:ascii="Times New Roman" w:hAnsi="Times New Roman" w:cs="Times New Roman"/>
-          <w:sz w:val="28"/>
-          <w:szCs w:val="28"/>
-          <w:lang w:val="en-US"/>
-        </w:rPr>
-        <w:t xml:space="preserve"> </w:t>
-      </w:r>
-      <w:proofErr w:type="spellStart"/>
-      <w:r>
-        <w:rPr>
-          <w:rFonts w:ascii="Times New Roman" w:hAnsi="Times New Roman" w:cs="Times New Roman"/>
-          <w:sz w:val="28"/>
-          <w:szCs w:val="28"/>
-          <w:lang w:val="en-US"/>
-        </w:rPr>
-        <w:t>không</w:t>
-      </w:r>
-      <w:proofErr w:type="spellEnd"/>
-      <w:r>
-        <w:rPr>
-          <w:rFonts w:ascii="Times New Roman" w:hAnsi="Times New Roman" w:cs="Times New Roman"/>
-          <w:sz w:val="28"/>
-          <w:szCs w:val="28"/>
-          <w:lang w:val="en-US"/>
-        </w:rPr>
-        <w:t xml:space="preserve"> prompt </w:t>
-      </w:r>
-      <w:proofErr w:type="spellStart"/>
-      <w:r>
-        <w:rPr>
-          <w:rFonts w:ascii="Times New Roman" w:hAnsi="Times New Roman" w:cs="Times New Roman"/>
-          <w:sz w:val="28"/>
-          <w:szCs w:val="28"/>
-          <w:lang w:val="en-US"/>
-        </w:rPr>
-        <w:t>yêu</w:t>
-      </w:r>
-      <w:proofErr w:type="spellEnd"/>
-      <w:r>
-        <w:rPr>
-          <w:rFonts w:ascii="Times New Roman" w:hAnsi="Times New Roman" w:cs="Times New Roman"/>
-          <w:sz w:val="28"/>
-          <w:szCs w:val="28"/>
-          <w:lang w:val="en-US"/>
-        </w:rPr>
-        <w:t xml:space="preserve"> </w:t>
-      </w:r>
-      <w:proofErr w:type="spellStart"/>
-      <w:r>
-        <w:rPr>
-          <w:rFonts w:ascii="Times New Roman" w:hAnsi="Times New Roman" w:cs="Times New Roman"/>
-          <w:sz w:val="28"/>
-          <w:szCs w:val="28"/>
-          <w:lang w:val="en-US"/>
-        </w:rPr>
-        <w:t>cầu</w:t>
-      </w:r>
-      <w:proofErr w:type="spellEnd"/>
-      <w:r>
-        <w:rPr>
-          <w:rFonts w:ascii="Times New Roman" w:hAnsi="Times New Roman" w:cs="Times New Roman"/>
-          <w:sz w:val="28"/>
-          <w:szCs w:val="28"/>
-          <w:lang w:val="en-US"/>
-        </w:rPr>
-        <w:t xml:space="preserve">, </w:t>
-      </w:r>
-      <w:proofErr w:type="spellStart"/>
-      <w:r>
-        <w:rPr>
-          <w:rFonts w:ascii="Times New Roman" w:hAnsi="Times New Roman" w:cs="Times New Roman"/>
-          <w:sz w:val="28"/>
-          <w:szCs w:val="28"/>
-          <w:lang w:val="en-US"/>
-        </w:rPr>
-        <w:t>nhưng</w:t>
-      </w:r>
-      <w:proofErr w:type="spellEnd"/>
-      <w:r>
-        <w:rPr>
-          <w:rFonts w:ascii="Times New Roman" w:hAnsi="Times New Roman" w:cs="Times New Roman"/>
-          <w:sz w:val="28"/>
-          <w:szCs w:val="28"/>
-          <w:lang w:val="en-US"/>
-        </w:rPr>
-        <w:t xml:space="preserve"> AI </w:t>
-      </w:r>
-      <w:proofErr w:type="spellStart"/>
-      <w:r>
-        <w:rPr>
-          <w:rFonts w:ascii="Times New Roman" w:hAnsi="Times New Roman" w:cs="Times New Roman"/>
-          <w:sz w:val="28"/>
-          <w:szCs w:val="28"/>
-          <w:lang w:val="en-US"/>
-        </w:rPr>
-        <w:t>đã</w:t>
-      </w:r>
-      <w:proofErr w:type="spellEnd"/>
-      <w:r>
-        <w:rPr>
-          <w:rFonts w:ascii="Times New Roman" w:hAnsi="Times New Roman" w:cs="Times New Roman"/>
-          <w:sz w:val="28"/>
-          <w:szCs w:val="28"/>
-          <w:lang w:val="en-US"/>
-        </w:rPr>
-        <w:t xml:space="preserve"> </w:t>
-      </w:r>
-      <w:proofErr w:type="spellStart"/>
-      <w:r>
-        <w:rPr>
-          <w:rFonts w:ascii="Times New Roman" w:hAnsi="Times New Roman" w:cs="Times New Roman"/>
-          <w:sz w:val="28"/>
-          <w:szCs w:val="28"/>
-          <w:lang w:val="en-US"/>
-        </w:rPr>
-        <w:t>đọc</w:t>
-      </w:r>
-      <w:proofErr w:type="spellEnd"/>
-      <w:r>
-        <w:rPr>
-          <w:rFonts w:ascii="Times New Roman" w:hAnsi="Times New Roman" w:cs="Times New Roman"/>
-          <w:sz w:val="28"/>
-          <w:szCs w:val="28"/>
-          <w:lang w:val="en-US"/>
-        </w:rPr>
-        <w:t xml:space="preserve"> </w:t>
-      </w:r>
-      <w:proofErr w:type="spellStart"/>
-      <w:r>
-        <w:rPr>
-          <w:rFonts w:ascii="Times New Roman" w:hAnsi="Times New Roman" w:cs="Times New Roman"/>
-          <w:sz w:val="28"/>
-          <w:szCs w:val="28"/>
-          <w:lang w:val="en-US"/>
-        </w:rPr>
-        <w:t>đề</w:t>
-      </w:r>
-      <w:proofErr w:type="spellEnd"/>
-      <w:r>
-        <w:rPr>
-          <w:rFonts w:ascii="Times New Roman" w:hAnsi="Times New Roman" w:cs="Times New Roman"/>
-          <w:sz w:val="28"/>
-          <w:szCs w:val="28"/>
-          <w:lang w:val="en-US"/>
-        </w:rPr>
-        <w:t xml:space="preserve"> </w:t>
-      </w:r>
-      <w:proofErr w:type="spellStart"/>
-      <w:r>
-        <w:rPr>
-          <w:rFonts w:ascii="Times New Roman" w:hAnsi="Times New Roman" w:cs="Times New Roman"/>
-          <w:sz w:val="28"/>
-          <w:szCs w:val="28"/>
-          <w:lang w:val="en-US"/>
-        </w:rPr>
-        <w:t>bài</w:t>
-      </w:r>
-      <w:proofErr w:type="spellEnd"/>
-      <w:r>
-        <w:rPr>
-          <w:rFonts w:ascii="Times New Roman" w:hAnsi="Times New Roman" w:cs="Times New Roman"/>
-          <w:sz w:val="28"/>
-          <w:szCs w:val="28"/>
-          <w:lang w:val="en-US"/>
-        </w:rPr>
-        <w:t xml:space="preserve"> </w:t>
-      </w:r>
-      <w:proofErr w:type="spellStart"/>
-      <w:r>
-        <w:rPr>
-          <w:rFonts w:ascii="Times New Roman" w:hAnsi="Times New Roman" w:cs="Times New Roman"/>
-          <w:sz w:val="28"/>
-          <w:szCs w:val="28"/>
-          <w:lang w:val="en-US"/>
-        </w:rPr>
-        <w:t>và</w:t>
-      </w:r>
-      <w:proofErr w:type="spellEnd"/>
-      <w:r>
-        <w:rPr>
-          <w:rFonts w:ascii="Times New Roman" w:hAnsi="Times New Roman" w:cs="Times New Roman"/>
-          <w:sz w:val="28"/>
-          <w:szCs w:val="28"/>
-          <w:lang w:val="en-US"/>
-        </w:rPr>
-        <w:t xml:space="preserve"> </w:t>
-      </w:r>
-      <w:proofErr w:type="spellStart"/>
-      <w:r>
-        <w:rPr>
-          <w:rFonts w:ascii="Times New Roman" w:hAnsi="Times New Roman" w:cs="Times New Roman"/>
-          <w:sz w:val="28"/>
-          <w:szCs w:val="28"/>
-          <w:lang w:val="en-US"/>
-        </w:rPr>
-        <w:t>có</w:t>
-      </w:r>
-      <w:proofErr w:type="spellEnd"/>
-      <w:r>
-        <w:rPr>
-          <w:rFonts w:ascii="Times New Roman" w:hAnsi="Times New Roman" w:cs="Times New Roman"/>
-          <w:sz w:val="28"/>
-          <w:szCs w:val="28"/>
-          <w:lang w:val="en-US"/>
-        </w:rPr>
-        <w:t xml:space="preserve"> </w:t>
-      </w:r>
-      <w:proofErr w:type="spellStart"/>
-      <w:r>
-        <w:rPr>
-          <w:rFonts w:ascii="Times New Roman" w:hAnsi="Times New Roman" w:cs="Times New Roman"/>
-          <w:sz w:val="28"/>
-          <w:szCs w:val="28"/>
-          <w:lang w:val="en-US"/>
-        </w:rPr>
-        <w:t>tóm</w:t>
-      </w:r>
-      <w:proofErr w:type="spellEnd"/>
-      <w:r>
-        <w:rPr>
-          <w:rFonts w:ascii="Times New Roman" w:hAnsi="Times New Roman" w:cs="Times New Roman"/>
-          <w:sz w:val="28"/>
-          <w:szCs w:val="28"/>
-          <w:lang w:val="en-US"/>
-        </w:rPr>
-        <w:t xml:space="preserve"> </w:t>
-      </w:r>
-      <w:proofErr w:type="spellStart"/>
-      <w:r>
-        <w:rPr>
-          <w:rFonts w:ascii="Times New Roman" w:hAnsi="Times New Roman" w:cs="Times New Roman"/>
-          <w:sz w:val="28"/>
-          <w:szCs w:val="28"/>
-          <w:lang w:val="en-US"/>
-        </w:rPr>
-        <w:t>tắt</w:t>
-      </w:r>
-      <w:proofErr w:type="spellEnd"/>
-      <w:r>
-        <w:rPr>
-          <w:rFonts w:ascii="Times New Roman" w:hAnsi="Times New Roman" w:cs="Times New Roman"/>
-          <w:sz w:val="28"/>
-          <w:szCs w:val="28"/>
-          <w:lang w:val="en-US"/>
-        </w:rPr>
-        <w:t xml:space="preserve"> </w:t>
-      </w:r>
-      <w:proofErr w:type="spellStart"/>
-      <w:r>
-        <w:rPr>
-          <w:rFonts w:ascii="Times New Roman" w:hAnsi="Times New Roman" w:cs="Times New Roman"/>
-          <w:sz w:val="28"/>
-          <w:szCs w:val="28"/>
-          <w:lang w:val="en-US"/>
-        </w:rPr>
-        <w:t>lúc</w:t>
-      </w:r>
-      <w:proofErr w:type="spellEnd"/>
-      <w:r>
-        <w:rPr>
-          <w:rFonts w:ascii="Times New Roman" w:hAnsi="Times New Roman" w:cs="Times New Roman"/>
-          <w:sz w:val="28"/>
-          <w:szCs w:val="28"/>
-          <w:lang w:val="en-US"/>
-        </w:rPr>
-        <w:t xml:space="preserve"> </w:t>
-      </w:r>
-      <w:proofErr w:type="spellStart"/>
-      <w:r>
-        <w:rPr>
-          <w:rFonts w:ascii="Times New Roman" w:hAnsi="Times New Roman" w:cs="Times New Roman"/>
-          <w:sz w:val="28"/>
-          <w:szCs w:val="28"/>
-          <w:lang w:val="en-US"/>
-        </w:rPr>
-        <w:t>trước</w:t>
-      </w:r>
-      <w:proofErr w:type="spellEnd"/>
-      <w:r>
-        <w:rPr>
-          <w:rFonts w:ascii="Times New Roman" w:hAnsi="Times New Roman" w:cs="Times New Roman"/>
-          <w:sz w:val="28"/>
-          <w:szCs w:val="28"/>
-          <w:lang w:val="en-US"/>
-        </w:rPr>
-        <w:t xml:space="preserve"> </w:t>
-      </w:r>
-      <w:proofErr w:type="spellStart"/>
-      <w:r>
-        <w:rPr>
-          <w:rFonts w:ascii="Times New Roman" w:hAnsi="Times New Roman" w:cs="Times New Roman"/>
-          <w:sz w:val="28"/>
-          <w:szCs w:val="28"/>
-          <w:lang w:val="en-US"/>
-        </w:rPr>
-        <w:t>rằng</w:t>
-      </w:r>
-      <w:proofErr w:type="spellEnd"/>
-      <w:r>
-        <w:rPr>
-          <w:rFonts w:ascii="Times New Roman" w:hAnsi="Times New Roman" w:cs="Times New Roman"/>
-          <w:sz w:val="28"/>
-          <w:szCs w:val="28"/>
-          <w:lang w:val="en-US"/>
-        </w:rPr>
-        <w:t xml:space="preserve"> </w:t>
-      </w:r>
-      <w:proofErr w:type="spellStart"/>
-      <w:r>
-        <w:rPr>
-          <w:rFonts w:ascii="Times New Roman" w:hAnsi="Times New Roman" w:cs="Times New Roman"/>
-          <w:sz w:val="28"/>
-          <w:szCs w:val="28"/>
-          <w:lang w:val="en-US"/>
-        </w:rPr>
-        <w:t>phải</w:t>
-      </w:r>
-      <w:proofErr w:type="spellEnd"/>
-      <w:r>
-        <w:rPr>
-          <w:rFonts w:ascii="Times New Roman" w:hAnsi="Times New Roman" w:cs="Times New Roman"/>
-          <w:sz w:val="28"/>
-          <w:szCs w:val="28"/>
-          <w:lang w:val="en-US"/>
-        </w:rPr>
-        <w:t xml:space="preserve"> ch</w:t>
-      </w:r>
-      <w:proofErr w:type="spellStart"/>
-      <w:r>
-        <w:rPr>
-          <w:rFonts w:ascii="Times New Roman" w:hAnsi="Times New Roman" w:cs="Times New Roman"/>
-          <w:sz w:val="28"/>
-          <w:szCs w:val="28"/>
-          <w:lang w:val="en-US"/>
-        </w:rPr>
-        <w:t>ụp</w:t>
       </w:r>
       <w:proofErr w:type="spellEnd"/>
       <w:r>
@@ -50996,47 +50344,7 @@
           <w:szCs w:val="28"/>
           <w:lang w:val="en-US"/>
         </w:rPr>
-        <w:t xml:space="preserve"> bug ở pool C </w:t>
-      </w:r>
-      <w:proofErr w:type="gramStart"/>
-      <w:r>
-        <w:rPr>
-          <w:rFonts w:ascii="Times New Roman" w:hAnsi="Times New Roman" w:cs="Times New Roman"/>
-          <w:sz w:val="28"/>
-          <w:szCs w:val="28"/>
-          <w:lang w:val="en-US"/>
-        </w:rPr>
-        <w:t>( ACL</w:t>
-      </w:r>
-      <w:proofErr w:type="gramEnd"/>
-      <w:r>
-        <w:rPr>
-          <w:rFonts w:ascii="Times New Roman" w:hAnsi="Times New Roman" w:cs="Times New Roman"/>
-          <w:sz w:val="28"/>
-          <w:szCs w:val="28"/>
-          <w:lang w:val="en-US"/>
-        </w:rPr>
-        <w:t xml:space="preserve"> – D</w:t>
-      </w:r>
-      <w:proofErr w:type="gramStart"/>
-      <w:r>
-        <w:rPr>
-          <w:rFonts w:ascii="Times New Roman" w:hAnsi="Times New Roman" w:cs="Times New Roman"/>
-          <w:sz w:val="28"/>
-          <w:szCs w:val="28"/>
-          <w:lang w:val="en-US"/>
-        </w:rPr>
-        <w:t>08 )</w:t>
-      </w:r>
-      <w:proofErr w:type="gramEnd"/>
-      <w:r>
-        <w:rPr>
-          <w:rFonts w:ascii="Times New Roman" w:hAnsi="Times New Roman" w:cs="Times New Roman"/>
-          <w:sz w:val="28"/>
-          <w:szCs w:val="28"/>
-          <w:lang w:val="en-US"/>
-        </w:rPr>
-        <w:t xml:space="preserve"> </w:t>
+        <w:t xml:space="preserve"> bug ở pool C ( ACL – D08 ) </w:t>
       </w:r>
       <w:proofErr w:type="spellStart"/>
       <w:r>
@@ -51802,27 +51110,7 @@
           <w:szCs w:val="28"/>
           <w:lang w:val="en-US"/>
         </w:rPr>
-        <w:t xml:space="preserve"> </w:t>
-      </w:r>
-      <w:proofErr w:type="gramStart"/>
-      <w:r>
-        <w:rPr>
-          <w:rFonts w:ascii="Times New Roman" w:hAnsi="Times New Roman" w:cs="Times New Roman"/>
-          <w:sz w:val="28"/>
-          <w:szCs w:val="28"/>
-          <w:lang w:val="en-US"/>
-        </w:rPr>
-        <w:t>( Quantity</w:t>
-      </w:r>
-      <w:proofErr w:type="gramEnd"/>
-      <w:r>
-        <w:rPr>
-          <w:rFonts w:ascii="Times New Roman" w:hAnsi="Times New Roman" w:cs="Times New Roman"/>
-          <w:sz w:val="28"/>
-          <w:szCs w:val="28"/>
-          <w:lang w:val="en-US"/>
-        </w:rPr>
-        <w:t xml:space="preserve">) </w:t>
+        <w:t xml:space="preserve"> ( Quantity) </w:t>
       </w:r>
       <w:proofErr w:type="spellStart"/>
       <w:r>
@@ -52585,8 +51873,8 @@
     <w:p/>
     <w:p/>
     <w:sectPr>
-      <w:headerReference w:type="default" r:id="rId14"/>
-      <w:footerReference w:type="default" r:id="rId15"/>
+      <w:headerReference w:type="default" r:id="rId15"/>
+      <w:footerReference w:type="default" r:id="rId16"/>
       <w:pgSz w:w="11906" w:h="16838"/>
       <w:pgMar w:top="720" w:right="720" w:bottom="720" w:left="720" w:header="720" w:footer="720" w:gutter="0"/>
       <w:cols w:space="720"/>
@@ -53520,6 +52808,7 @@
   <w:style w:type="character" w:default="1" w:styleId="DefaultParagraphFont">
     <w:name w:val="Default Paragraph Font"/>
     <w:uiPriority w:val="1"/>
+    <w:semiHidden/>
     <w:unhideWhenUsed/>
   </w:style>
   <w:style w:type="table" w:default="1" w:styleId="TableNormal">

</xml_diff>